<commit_message>
Actualizar documento y codigo
</commit_message>
<xml_diff>
--- a/Laboratorio_El_sitio_web_esta_roto.docx
+++ b/Laboratorio_El_sitio_web_esta_roto.docx
@@ -2,19 +2,861 @@
 <file path=word/document.xml><?xml version="1.0" encoding="utf-8"?>
 <w:document xmlns:wpc="http://schemas.microsoft.com/office/word/2010/wordprocessingCanvas" xmlns:cx="http://schemas.microsoft.com/office/drawing/2014/chartex" xmlns:cx1="http://schemas.microsoft.com/office/drawing/2015/9/8/chartex" xmlns:cx2="http://schemas.microsoft.com/office/drawing/2015/10/21/chartex" xmlns:cx3="http://schemas.microsoft.com/office/drawing/2016/5/9/chartex" xmlns:cx4="http://schemas.microsoft.com/office/drawing/2016/5/10/chartex" xmlns:cx5="http://schemas.microsoft.com/office/drawing/2016/5/11/chartex" xmlns:cx6="http://schemas.microsoft.com/office/drawing/2016/5/12/chartex" xmlns:cx7="http://schemas.microsoft.com/office/drawing/2016/5/13/chartex" xmlns:cx8="http://schemas.microsoft.com/office/drawing/2016/5/14/chartex" xmlns:mc="http://schemas.openxmlformats.org/markup-compatibility/2006" xmlns:aink="http://schemas.microsoft.com/office/drawing/2016/ink" xmlns:am3d="http://schemas.microsoft.com/office/drawing/2017/model3d" xmlns:o="urn:schemas-microsoft-com:office:office" xmlns:oel="http://schemas.microsoft.com/office/2019/extlst" xmlns:r="http://schemas.openxmlformats.org/officeDocument/2006/relationships" xmlns:m="http://schemas.openxmlformats.org/officeDocument/2006/math" xmlns:v="urn:schemas-microsoft-com:vml" xmlns:wp14="http://schemas.microsoft.com/office/word/2010/wordprocessingDrawing" xmlns:wp="http://schemas.openxmlformats.org/drawingml/2006/wordprocessingDrawing" xmlns:w10="urn:schemas-microsoft-com:office:word" xmlns:w="http://schemas.openxmlformats.org/wordprocessingml/2006/main" xmlns:w14="http://schemas.microsoft.com/office/word/2010/wordml" xmlns:w15="http://schemas.microsoft.com/office/word/2012/wordml" xmlns:w16cex="http://schemas.microsoft.com/office/word/2018/wordml/cex" xmlns:w16cid="http://schemas.microsoft.com/office/word/2016/wordml/cid" xmlns:w16="http://schemas.microsoft.com/office/word/2018/wordml" xmlns:w16du="http://schemas.microsoft.com/office/word/2023/wordml/word16du" xmlns:w16sdtdh="http://schemas.microsoft.com/office/word/2020/wordml/sdtdatahash" xmlns:w16sdtfl="http://schemas.microsoft.com/office/word/2024/wordml/sdtformatlock" xmlns:w16se="http://schemas.microsoft.com/office/word/2015/wordml/symex" xmlns:wpg="http://schemas.microsoft.com/office/word/2010/wordprocessingGroup" xmlns:wpi="http://schemas.microsoft.com/office/word/2010/wordprocessingInk" xmlns:wne="http://schemas.microsoft.com/office/word/2006/wordml" xmlns:wps="http://schemas.microsoft.com/office/word/2010/wordprocessingShape" mc:Ignorable="w14 w15 w16se w16cid w16 w16cex w16sdtdh w16sdtfl w16du wp14">
   <w:body>
+    <w:tbl>
+      <w:tblPr>
+        <w:tblpPr w:leftFromText="141" w:rightFromText="141" w:vertAnchor="text" w:tblpY="-186"/>
+        <w:tblW w:w="0" w:type="auto"/>
+        <w:tblCellMar>
+          <w:top w:w="15" w:type="dxa"/>
+          <w:left w:w="15" w:type="dxa"/>
+          <w:bottom w:w="15" w:type="dxa"/>
+          <w:right w:w="15" w:type="dxa"/>
+        </w:tblCellMar>
+        <w:tblLook w:val="04A0" w:firstRow="1" w:lastRow="0" w:firstColumn="1" w:lastColumn="0" w:noHBand="0" w:noVBand="1"/>
+      </w:tblPr>
+      <w:tblGrid>
+        <w:gridCol w:w="1476"/>
+        <w:gridCol w:w="7602"/>
+        <w:gridCol w:w="1146"/>
+      </w:tblGrid>
+      <w:tr>
+        <w:trPr>
+          <w:trHeight w:val="1418"/>
+        </w:trPr>
+        <w:tc>
+          <w:tcPr>
+            <w:tcW w:w="0" w:type="auto"/>
+            <w:tcMar>
+              <w:top w:w="0" w:type="dxa"/>
+              <w:left w:w="108" w:type="dxa"/>
+              <w:bottom w:w="0" w:type="dxa"/>
+              <w:right w:w="108" w:type="dxa"/>
+            </w:tcMar>
+            <w:vAlign w:val="center"/>
+            <w:hideMark/>
+          </w:tcPr>
+          <w:p>
+            <w:pPr>
+              <w:spacing w:after="0" w:line="240" w:lineRule="auto"/>
+              <w:jc w:val="center"/>
+              <w:rPr>
+                <w:rFonts w:ascii="Times New Roman" w:eastAsia="Times New Roman" w:hAnsi="Times New Roman" w:cs="Times New Roman"/>
+                <w:sz w:val="24"/>
+                <w:szCs w:val="24"/>
+              </w:rPr>
+            </w:pPr>
+            <w:r>
+              <w:rPr>
+                <w:rFonts w:eastAsia="Times New Roman"/>
+                <w:noProof/>
+                <w:color w:val="000000"/>
+                <w:bdr w:val="none" w:sz="0" w:space="0" w:color="auto" w:frame="1"/>
+              </w:rPr>
+              <w:drawing>
+                <wp:inline distT="0" distB="0" distL="0" distR="0" wp14:anchorId="41B379BD" wp14:editId="1D522EFD">
+                  <wp:extent cx="793750" cy="724535"/>
+                  <wp:effectExtent l="0" t="0" r="6350" b="0"/>
+                  <wp:docPr id="108" name="Imagen 108" descr="Archivo:Escudo UAZ.jpg - Wikipedia, la enciclopedia libre"/>
+                  <wp:cNvGraphicFramePr>
+                    <a:graphicFrameLocks xmlns:a="http://schemas.openxmlformats.org/drawingml/2006/main" noChangeAspect="1"/>
+                  </wp:cNvGraphicFramePr>
+                  <a:graphic xmlns:a="http://schemas.openxmlformats.org/drawingml/2006/main">
+                    <a:graphicData uri="http://schemas.openxmlformats.org/drawingml/2006/picture">
+                      <pic:pic xmlns:pic="http://schemas.openxmlformats.org/drawingml/2006/picture">
+                        <pic:nvPicPr>
+                          <pic:cNvPr id="0" name="Picture 1" descr="Archivo:Escudo UAZ.jpg - Wikipedia, la enciclopedia libre"/>
+                          <pic:cNvPicPr>
+                            <a:picLocks noChangeAspect="1" noChangeArrowheads="1"/>
+                          </pic:cNvPicPr>
+                        </pic:nvPicPr>
+                        <pic:blipFill>
+                          <a:blip r:embed="rId6">
+                            <a:extLst>
+                              <a:ext uri="{28A0092B-C50C-407E-A947-70E740481C1C}">
+                                <a14:useLocalDpi xmlns:a14="http://schemas.microsoft.com/office/drawing/2010/main" val="0"/>
+                              </a:ext>
+                            </a:extLst>
+                          </a:blip>
+                          <a:srcRect/>
+                          <a:stretch>
+                            <a:fillRect/>
+                          </a:stretch>
+                        </pic:blipFill>
+                        <pic:spPr bwMode="auto">
+                          <a:xfrm>
+                            <a:off x="0" y="0"/>
+                            <a:ext cx="793750" cy="724535"/>
+                          </a:xfrm>
+                          <a:prstGeom prst="rect">
+                            <a:avLst/>
+                          </a:prstGeom>
+                          <a:noFill/>
+                          <a:ln>
+                            <a:noFill/>
+                          </a:ln>
+                        </pic:spPr>
+                      </pic:pic>
+                    </a:graphicData>
+                  </a:graphic>
+                </wp:inline>
+              </w:drawing>
+            </w:r>
+          </w:p>
+        </w:tc>
+        <w:tc>
+          <w:tcPr>
+            <w:tcW w:w="0" w:type="auto"/>
+            <w:tcMar>
+              <w:top w:w="0" w:type="dxa"/>
+              <w:left w:w="108" w:type="dxa"/>
+              <w:bottom w:w="0" w:type="dxa"/>
+              <w:right w:w="108" w:type="dxa"/>
+            </w:tcMar>
+            <w:vAlign w:val="center"/>
+            <w:hideMark/>
+          </w:tcPr>
+          <w:p>
+            <w:pPr>
+              <w:spacing w:after="0" w:line="240" w:lineRule="auto"/>
+              <w:jc w:val="center"/>
+              <w:rPr>
+                <w:rFonts w:ascii="Times New Roman" w:eastAsia="Times New Roman" w:hAnsi="Times New Roman" w:cs="Times New Roman"/>
+                <w:sz w:val="24"/>
+                <w:szCs w:val="24"/>
+                <w:lang w:val="es-MX"/>
+              </w:rPr>
+            </w:pPr>
+            <w:r>
+              <w:rPr>
+                <w:rFonts w:ascii="Times New Roman" w:eastAsia="Times New Roman" w:hAnsi="Times New Roman" w:cs="Times New Roman"/>
+                <w:b/>
+                <w:bCs/>
+                <w:color w:val="002060"/>
+                <w:sz w:val="28"/>
+                <w:szCs w:val="28"/>
+                <w:lang w:val="es-MX"/>
+              </w:rPr>
+              <w:t xml:space="preserve">UNIVERSIDAD AUTÓNOMA DE ZACATECAS </w:t>
+            </w:r>
+            <w:r>
+              <w:rPr>
+                <w:rFonts w:ascii="Times New Roman" w:eastAsia="Times New Roman" w:hAnsi="Times New Roman" w:cs="Times New Roman"/>
+                <w:b/>
+                <w:bCs/>
+                <w:i/>
+                <w:iCs/>
+                <w:color w:val="002060"/>
+                <w:lang w:val="es-MX"/>
+              </w:rPr>
+              <w:t>“FRANCISCO GARCÍA SALINAS”</w:t>
+            </w:r>
+            <w:r>
+              <w:rPr>
+                <w:rFonts w:ascii="Times New Roman" w:eastAsia="Times New Roman" w:hAnsi="Times New Roman" w:cs="Times New Roman"/>
+                <w:b/>
+                <w:bCs/>
+                <w:color w:val="002060"/>
+                <w:lang w:val="es-MX"/>
+              </w:rPr>
+              <w:t> </w:t>
+            </w:r>
+          </w:p>
+          <w:p>
+            <w:pPr>
+              <w:spacing w:after="0" w:line="240" w:lineRule="auto"/>
+              <w:jc w:val="center"/>
+              <w:rPr>
+                <w:rFonts w:ascii="Times New Roman" w:eastAsia="Times New Roman" w:hAnsi="Times New Roman" w:cs="Times New Roman"/>
+                <w:sz w:val="24"/>
+                <w:szCs w:val="24"/>
+                <w:lang w:val="es-MX"/>
+              </w:rPr>
+            </w:pPr>
+            <w:r>
+              <w:rPr>
+                <w:rFonts w:ascii="Times New Roman" w:eastAsia="Times New Roman" w:hAnsi="Times New Roman" w:cs="Times New Roman"/>
+                <w:b/>
+                <w:bCs/>
+                <w:color w:val="002060"/>
+                <w:lang w:val="es-MX"/>
+              </w:rPr>
+              <w:t>CAMPUS JALPA</w:t>
+            </w:r>
+          </w:p>
+          <w:p>
+            <w:pPr>
+              <w:spacing w:after="0" w:line="240" w:lineRule="auto"/>
+              <w:jc w:val="center"/>
+              <w:rPr>
+                <w:rFonts w:ascii="Times New Roman" w:eastAsia="Times New Roman" w:hAnsi="Times New Roman" w:cs="Times New Roman"/>
+                <w:sz w:val="24"/>
+                <w:szCs w:val="24"/>
+                <w:lang w:val="es-MX"/>
+              </w:rPr>
+            </w:pPr>
+            <w:r>
+              <w:rPr>
+                <w:rFonts w:ascii="Times New Roman" w:eastAsia="Times New Roman" w:hAnsi="Times New Roman" w:cs="Times New Roman"/>
+                <w:b/>
+                <w:bCs/>
+                <w:color w:val="002060"/>
+                <w:sz w:val="20"/>
+                <w:szCs w:val="20"/>
+                <w:lang w:val="es-MX"/>
+              </w:rPr>
+              <w:t>UNIDAD ACADÉMICA DE INGENIERÍA ELÉCTRICA JALPA</w:t>
+            </w:r>
+          </w:p>
+        </w:tc>
+        <w:tc>
+          <w:tcPr>
+            <w:tcW w:w="0" w:type="auto"/>
+            <w:tcMar>
+              <w:top w:w="0" w:type="dxa"/>
+              <w:left w:w="108" w:type="dxa"/>
+              <w:bottom w:w="0" w:type="dxa"/>
+              <w:right w:w="108" w:type="dxa"/>
+            </w:tcMar>
+            <w:vAlign w:val="center"/>
+            <w:hideMark/>
+          </w:tcPr>
+          <w:p>
+            <w:pPr>
+              <w:spacing w:after="0" w:line="240" w:lineRule="auto"/>
+              <w:jc w:val="center"/>
+              <w:rPr>
+                <w:rFonts w:ascii="Times New Roman" w:eastAsia="Times New Roman" w:hAnsi="Times New Roman" w:cs="Times New Roman"/>
+                <w:sz w:val="24"/>
+                <w:szCs w:val="24"/>
+              </w:rPr>
+            </w:pPr>
+            <w:r>
+              <w:rPr>
+                <w:rFonts w:eastAsia="Times New Roman"/>
+                <w:noProof/>
+                <w:color w:val="000000"/>
+                <w:bdr w:val="none" w:sz="0" w:space="0" w:color="auto" w:frame="1"/>
+              </w:rPr>
+              <w:drawing>
+                <wp:inline distT="0" distB="0" distL="0" distR="0" wp14:anchorId="74E165E4" wp14:editId="060ECEB2">
+                  <wp:extent cx="586740" cy="724535"/>
+                  <wp:effectExtent l="0" t="0" r="3810" b="0"/>
+                  <wp:docPr id="109" name="Imagen 109" descr="https://inscripciones-uaie.org/gatejo/uaz2.png"/>
+                  <wp:cNvGraphicFramePr>
+                    <a:graphicFrameLocks xmlns:a="http://schemas.openxmlformats.org/drawingml/2006/main" noChangeAspect="1"/>
+                  </wp:cNvGraphicFramePr>
+                  <a:graphic xmlns:a="http://schemas.openxmlformats.org/drawingml/2006/main">
+                    <a:graphicData uri="http://schemas.openxmlformats.org/drawingml/2006/picture">
+                      <pic:pic xmlns:pic="http://schemas.openxmlformats.org/drawingml/2006/picture">
+                        <pic:nvPicPr>
+                          <pic:cNvPr id="0" name="Picture 2" descr="https://inscripciones-uaie.org/gatejo/uaz2.png"/>
+                          <pic:cNvPicPr>
+                            <a:picLocks noChangeAspect="1" noChangeArrowheads="1"/>
+                          </pic:cNvPicPr>
+                        </pic:nvPicPr>
+                        <pic:blipFill>
+                          <a:blip r:embed="rId7">
+                            <a:extLst>
+                              <a:ext uri="{28A0092B-C50C-407E-A947-70E740481C1C}">
+                                <a14:useLocalDpi xmlns:a14="http://schemas.microsoft.com/office/drawing/2010/main" val="0"/>
+                              </a:ext>
+                            </a:extLst>
+                          </a:blip>
+                          <a:srcRect/>
+                          <a:stretch>
+                            <a:fillRect/>
+                          </a:stretch>
+                        </pic:blipFill>
+                        <pic:spPr bwMode="auto">
+                          <a:xfrm>
+                            <a:off x="0" y="0"/>
+                            <a:ext cx="586740" cy="724535"/>
+                          </a:xfrm>
+                          <a:prstGeom prst="rect">
+                            <a:avLst/>
+                          </a:prstGeom>
+                          <a:noFill/>
+                          <a:ln>
+                            <a:noFill/>
+                          </a:ln>
+                        </pic:spPr>
+                      </pic:pic>
+                    </a:graphicData>
+                  </a:graphic>
+                </wp:inline>
+              </w:drawing>
+            </w:r>
+          </w:p>
+        </w:tc>
+      </w:tr>
+    </w:tbl>
+    <w:p/>
     <w:p>
       <w:pPr>
+        <w:spacing w:after="240" w:line="240" w:lineRule="auto"/>
+        <w:rPr>
+          <w:rFonts w:ascii="Times New Roman" w:eastAsia="Times New Roman" w:hAnsi="Times New Roman" w:cs="Times New Roman"/>
+          <w:sz w:val="24"/>
+          <w:szCs w:val="24"/>
+        </w:rPr>
+      </w:pPr>
+    </w:p>
+    <w:p>
+      <w:pPr>
+        <w:spacing w:line="240" w:lineRule="auto"/>
         <w:jc w:val="center"/>
         <w:rPr>
+          <w:rFonts w:ascii="Times New Roman" w:eastAsia="Times New Roman" w:hAnsi="Times New Roman" w:cs="Times New Roman"/>
+          <w:sz w:val="24"/>
+          <w:szCs w:val="24"/>
           <w:lang w:val="es-MX"/>
         </w:rPr>
       </w:pPr>
       <w:r>
+        <w:rPr>
+          <w:rFonts w:ascii="Times New Roman" w:eastAsia="Times New Roman" w:hAnsi="Times New Roman" w:cs="Times New Roman"/>
+          <w:b/>
+          <w:bCs/>
+          <w:color w:val="002060"/>
+          <w:sz w:val="28"/>
+          <w:szCs w:val="28"/>
+          <w:lang w:val="es-MX"/>
+        </w:rPr>
+        <w:t>INGENIERÍA EN TECNOLOGÍAS COMPUTACIONALES</w:t>
+      </w:r>
+    </w:p>
+    <w:p>
+      <w:pPr>
+        <w:spacing w:after="0" w:line="240" w:lineRule="auto"/>
+        <w:rPr>
+          <w:rFonts w:ascii="Times New Roman" w:eastAsia="Times New Roman" w:hAnsi="Times New Roman" w:cs="Times New Roman"/>
+          <w:sz w:val="24"/>
+          <w:szCs w:val="24"/>
+          <w:lang w:val="es-MX"/>
+        </w:rPr>
+      </w:pPr>
+    </w:p>
+    <w:p>
+      <w:pPr>
+        <w:spacing w:after="0" w:line="240" w:lineRule="auto"/>
+        <w:rPr>
+          <w:rFonts w:ascii="Times New Roman" w:eastAsia="Times New Roman" w:hAnsi="Times New Roman" w:cs="Times New Roman"/>
+          <w:sz w:val="24"/>
+          <w:szCs w:val="24"/>
+          <w:lang w:val="es-MX"/>
+        </w:rPr>
+      </w:pPr>
+    </w:p>
+    <w:p>
+      <w:pPr>
+        <w:spacing w:line="240" w:lineRule="auto"/>
+        <w:jc w:val="center"/>
+        <w:rPr>
+          <w:rFonts w:ascii="Times New Roman" w:eastAsia="Times New Roman" w:hAnsi="Times New Roman" w:cs="Times New Roman"/>
+          <w:sz w:val="24"/>
+          <w:szCs w:val="24"/>
+          <w:lang w:val="es-MX"/>
+        </w:rPr>
+      </w:pPr>
+      <w:r>
+        <w:rPr>
+          <w:rFonts w:ascii="Times New Roman" w:eastAsia="Times New Roman" w:hAnsi="Times New Roman" w:cs="Times New Roman"/>
+          <w:b/>
+          <w:bCs/>
+          <w:color w:val="002060"/>
+          <w:sz w:val="28"/>
+          <w:szCs w:val="28"/>
+          <w:lang w:val="es-MX"/>
+        </w:rPr>
+        <w:t>Desarrollo de Aplicaciones Web</w:t>
+      </w:r>
+    </w:p>
+    <w:p>
+      <w:pPr>
+        <w:spacing w:after="0" w:line="240" w:lineRule="auto"/>
+        <w:rPr>
+          <w:rFonts w:ascii="Times New Roman" w:eastAsia="Times New Roman" w:hAnsi="Times New Roman" w:cs="Times New Roman"/>
+          <w:sz w:val="24"/>
+          <w:szCs w:val="24"/>
+          <w:lang w:val="es-MX"/>
+        </w:rPr>
+      </w:pPr>
+    </w:p>
+    <w:p>
+      <w:pPr>
+        <w:spacing w:after="0" w:line="240" w:lineRule="auto"/>
+        <w:rPr>
+          <w:rFonts w:ascii="Times New Roman" w:eastAsia="Times New Roman" w:hAnsi="Times New Roman" w:cs="Times New Roman"/>
+          <w:sz w:val="24"/>
+          <w:szCs w:val="24"/>
+          <w:lang w:val="es-MX"/>
+        </w:rPr>
+      </w:pPr>
+    </w:p>
+    <w:p>
+      <w:pPr>
+        <w:spacing w:line="240" w:lineRule="auto"/>
+        <w:jc w:val="center"/>
+        <w:rPr>
+          <w:rFonts w:ascii="Times New Roman" w:eastAsia="Times New Roman" w:hAnsi="Times New Roman" w:cs="Times New Roman"/>
+          <w:sz w:val="24"/>
+          <w:szCs w:val="24"/>
+          <w:lang w:val="es-MX"/>
+        </w:rPr>
+      </w:pPr>
+      <w:r>
+        <w:rPr>
+          <w:rFonts w:ascii="Times New Roman" w:eastAsia="Times New Roman" w:hAnsi="Times New Roman" w:cs="Times New Roman"/>
+          <w:b/>
+          <w:bCs/>
+          <w:color w:val="002060"/>
+          <w:sz w:val="28"/>
+          <w:szCs w:val="28"/>
+          <w:lang w:val="es-MX"/>
+        </w:rPr>
+        <w:t xml:space="preserve">SEMESTRE: </w:t>
+      </w:r>
+      <w:r>
+        <w:rPr>
+          <w:rFonts w:ascii="Times New Roman" w:eastAsia="Times New Roman" w:hAnsi="Times New Roman" w:cs="Times New Roman"/>
+          <w:b/>
+          <w:bCs/>
+          <w:color w:val="002060"/>
+          <w:sz w:val="28"/>
+          <w:szCs w:val="28"/>
+          <w:lang w:val="es-MX"/>
+        </w:rPr>
+        <w:t>AGOSTO</w:t>
+      </w:r>
+      <w:r>
+        <w:rPr>
+          <w:rFonts w:ascii="Times New Roman" w:eastAsia="Times New Roman" w:hAnsi="Times New Roman" w:cs="Times New Roman"/>
+          <w:b/>
+          <w:bCs/>
+          <w:color w:val="002060"/>
+          <w:sz w:val="28"/>
+          <w:szCs w:val="28"/>
+          <w:lang w:val="es-MX"/>
+        </w:rPr>
+        <w:t xml:space="preserve"> –</w:t>
+      </w:r>
+      <w:r>
+        <w:rPr>
+          <w:rFonts w:ascii="Times New Roman" w:eastAsia="Times New Roman" w:hAnsi="Times New Roman" w:cs="Times New Roman"/>
+          <w:b/>
+          <w:bCs/>
+          <w:color w:val="002060"/>
+          <w:sz w:val="28"/>
+          <w:szCs w:val="28"/>
+          <w:lang w:val="es-MX"/>
+        </w:rPr>
+        <w:t xml:space="preserve"> DICIEMBRE</w:t>
+      </w:r>
+      <w:r>
+        <w:rPr>
+          <w:rFonts w:ascii="Times New Roman" w:eastAsia="Times New Roman" w:hAnsi="Times New Roman" w:cs="Times New Roman"/>
+          <w:b/>
+          <w:bCs/>
+          <w:color w:val="002060"/>
+          <w:sz w:val="28"/>
+          <w:szCs w:val="28"/>
+          <w:lang w:val="es-MX"/>
+        </w:rPr>
+        <w:t xml:space="preserve"> 2026</w:t>
+      </w:r>
+    </w:p>
+    <w:p>
+      <w:pPr>
+        <w:spacing w:after="0" w:line="240" w:lineRule="auto"/>
+        <w:rPr>
+          <w:rFonts w:ascii="Times New Roman" w:eastAsia="Times New Roman" w:hAnsi="Times New Roman" w:cs="Times New Roman"/>
+          <w:sz w:val="24"/>
+          <w:szCs w:val="24"/>
+          <w:lang w:val="es-MX"/>
+        </w:rPr>
+      </w:pPr>
+    </w:p>
+    <w:p>
+      <w:pPr>
+        <w:spacing w:after="0" w:line="240" w:lineRule="auto"/>
+        <w:rPr>
+          <w:rFonts w:ascii="Times New Roman" w:eastAsia="Times New Roman" w:hAnsi="Times New Roman" w:cs="Times New Roman"/>
+          <w:sz w:val="24"/>
+          <w:szCs w:val="24"/>
+          <w:lang w:val="es-MX"/>
+        </w:rPr>
+      </w:pPr>
+    </w:p>
+    <w:p>
+      <w:pPr>
+        <w:pStyle w:val="Ttulo2"/>
+        <w:spacing w:before="0"/>
+        <w:jc w:val="center"/>
+        <w:rPr>
+          <w:color w:val="002060"/>
+          <w:sz w:val="28"/>
+          <w:szCs w:val="28"/>
+          <w:lang w:val="es-MX"/>
+        </w:rPr>
+      </w:pPr>
+      <w:r>
+        <w:rPr>
+          <w:color w:val="002060"/>
+          <w:sz w:val="28"/>
+          <w:szCs w:val="28"/>
+          <w:lang w:val="es-MX"/>
+        </w:rPr>
+        <w:t>E</w:t>
+      </w:r>
+      <w:r>
+        <w:rPr>
+          <w:color w:val="002060"/>
+          <w:sz w:val="28"/>
+          <w:szCs w:val="28"/>
+          <w:lang w:val="es-MX"/>
+        </w:rPr>
+        <w:t>NTREGA DE EVIDENCIA</w:t>
+      </w:r>
+    </w:p>
+    <w:p>
+      <w:pPr>
+        <w:spacing w:line="240" w:lineRule="auto"/>
+        <w:jc w:val="center"/>
+        <w:rPr>
+          <w:b/>
+          <w:color w:val="002060"/>
+          <w:sz w:val="18"/>
+          <w:szCs w:val="28"/>
+          <w:lang w:val="es-MX"/>
+        </w:rPr>
+      </w:pPr>
+      <w:r>
+        <w:rPr>
+          <w:b/>
+          <w:color w:val="002060"/>
+          <w:szCs w:val="28"/>
+          <w:lang w:val="es-MX"/>
+        </w:rPr>
+        <w:t>Laboratorio: El sitio web está roto</w:t>
+      </w:r>
+    </w:p>
+    <w:p>
+      <w:pPr>
+        <w:spacing w:after="0" w:line="240" w:lineRule="auto"/>
+        <w:rPr>
+          <w:rFonts w:ascii="Times New Roman" w:eastAsia="Times New Roman" w:hAnsi="Times New Roman" w:cs="Times New Roman"/>
+          <w:sz w:val="24"/>
+          <w:szCs w:val="24"/>
+          <w:lang w:val="es-MX"/>
+        </w:rPr>
+      </w:pPr>
+    </w:p>
+    <w:p>
+      <w:pPr>
+        <w:spacing w:after="0" w:line="240" w:lineRule="auto"/>
+        <w:rPr>
+          <w:rFonts w:ascii="Times New Roman" w:eastAsia="Times New Roman" w:hAnsi="Times New Roman" w:cs="Times New Roman"/>
+          <w:sz w:val="24"/>
+          <w:szCs w:val="24"/>
+          <w:lang w:val="es-MX"/>
+        </w:rPr>
+      </w:pPr>
+    </w:p>
+    <w:p>
+      <w:pPr>
+        <w:spacing w:line="240" w:lineRule="auto"/>
+        <w:jc w:val="center"/>
+        <w:rPr>
+          <w:rFonts w:ascii="Times New Roman" w:eastAsia="Times New Roman" w:hAnsi="Times New Roman" w:cs="Times New Roman"/>
+          <w:sz w:val="24"/>
+          <w:szCs w:val="24"/>
+          <w:lang w:val="es-MX"/>
+        </w:rPr>
+      </w:pPr>
+      <w:r>
+        <w:rPr>
+          <w:rFonts w:ascii="Times New Roman" w:eastAsia="Times New Roman" w:hAnsi="Times New Roman" w:cs="Times New Roman"/>
+          <w:b/>
+          <w:bCs/>
+          <w:color w:val="002060"/>
+          <w:sz w:val="28"/>
+          <w:szCs w:val="28"/>
+          <w:lang w:val="es-MX"/>
+        </w:rPr>
+        <w:t xml:space="preserve">NOMBRE DEL ALUMNO(A): </w:t>
+      </w:r>
+      <w:r>
+        <w:rPr>
+          <w:rFonts w:ascii="Times New Roman" w:eastAsia="Times New Roman" w:hAnsi="Times New Roman" w:cs="Times New Roman"/>
+          <w:b/>
+          <w:bCs/>
+          <w:color w:val="002060"/>
+          <w:sz w:val="28"/>
+          <w:szCs w:val="28"/>
+          <w:lang w:val="es-MX"/>
+        </w:rPr>
+        <w:t>Jesús Emilio Romo López</w:t>
+      </w:r>
+    </w:p>
+    <w:p>
+      <w:pPr>
+        <w:spacing w:after="0" w:line="240" w:lineRule="auto"/>
+        <w:rPr>
+          <w:rFonts w:ascii="Times New Roman" w:eastAsia="Times New Roman" w:hAnsi="Times New Roman" w:cs="Times New Roman"/>
+          <w:sz w:val="24"/>
+          <w:szCs w:val="24"/>
+          <w:lang w:val="es-MX"/>
+        </w:rPr>
+      </w:pPr>
+    </w:p>
+    <w:p>
+      <w:pPr>
+        <w:spacing w:after="0" w:line="240" w:lineRule="auto"/>
+        <w:rPr>
+          <w:rFonts w:ascii="Times New Roman" w:eastAsia="Times New Roman" w:hAnsi="Times New Roman" w:cs="Times New Roman"/>
+          <w:sz w:val="24"/>
+          <w:szCs w:val="24"/>
+          <w:lang w:val="es-MX"/>
+        </w:rPr>
+      </w:pPr>
+    </w:p>
+    <w:p>
+      <w:pPr>
+        <w:spacing w:after="0" w:line="240" w:lineRule="auto"/>
+        <w:rPr>
+          <w:rFonts w:ascii="Times New Roman" w:eastAsia="Times New Roman" w:hAnsi="Times New Roman" w:cs="Times New Roman"/>
+          <w:sz w:val="24"/>
+          <w:szCs w:val="24"/>
+          <w:lang w:val="es-MX"/>
+        </w:rPr>
+      </w:pPr>
+    </w:p>
+    <w:p>
+      <w:pPr>
+        <w:spacing w:line="240" w:lineRule="auto"/>
+        <w:jc w:val="center"/>
+        <w:rPr>
+          <w:rFonts w:ascii="Times New Roman" w:eastAsia="Times New Roman" w:hAnsi="Times New Roman" w:cs="Times New Roman"/>
+          <w:b/>
+          <w:bCs/>
+          <w:color w:val="002060"/>
+          <w:sz w:val="28"/>
+          <w:szCs w:val="28"/>
+          <w:lang w:val="es-MX"/>
+        </w:rPr>
+      </w:pPr>
+      <w:r>
+        <w:rPr>
+          <w:rFonts w:ascii="Times New Roman" w:eastAsia="Times New Roman" w:hAnsi="Times New Roman" w:cs="Times New Roman"/>
+          <w:b/>
+          <w:bCs/>
+          <w:color w:val="002060"/>
+          <w:sz w:val="28"/>
+          <w:szCs w:val="28"/>
+          <w:lang w:val="es-MX"/>
+        </w:rPr>
+        <w:t>MATRÍCULA: 424018</w:t>
+      </w:r>
+      <w:r>
+        <w:rPr>
+          <w:rFonts w:ascii="Times New Roman" w:eastAsia="Times New Roman" w:hAnsi="Times New Roman" w:cs="Times New Roman"/>
+          <w:b/>
+          <w:bCs/>
+          <w:color w:val="002060"/>
+          <w:sz w:val="28"/>
+          <w:szCs w:val="28"/>
+          <w:lang w:val="es-MX"/>
+        </w:rPr>
+        <w:t>46</w:t>
+      </w:r>
+    </w:p>
+    <w:p>
+      <w:pPr>
+        <w:spacing w:after="240" w:line="240" w:lineRule="auto"/>
+        <w:rPr>
+          <w:rFonts w:ascii="Times New Roman" w:eastAsia="Times New Roman" w:hAnsi="Times New Roman" w:cs="Times New Roman"/>
+          <w:sz w:val="24"/>
+          <w:szCs w:val="24"/>
+          <w:lang w:val="es-MX"/>
+        </w:rPr>
+      </w:pPr>
+    </w:p>
+    <w:p>
+      <w:pPr>
+        <w:spacing w:after="240" w:line="240" w:lineRule="auto"/>
+        <w:rPr>
+          <w:rFonts w:ascii="Times New Roman" w:eastAsia="Times New Roman" w:hAnsi="Times New Roman" w:cs="Times New Roman"/>
+          <w:sz w:val="24"/>
+          <w:szCs w:val="24"/>
+          <w:lang w:val="es-MX"/>
+        </w:rPr>
+      </w:pPr>
+    </w:p>
+    <w:p>
+      <w:pPr>
+        <w:spacing w:line="240" w:lineRule="auto"/>
+        <w:jc w:val="center"/>
+        <w:rPr>
+          <w:rFonts w:ascii="Times New Roman" w:eastAsia="Times New Roman" w:hAnsi="Times New Roman" w:cs="Times New Roman"/>
+          <w:sz w:val="24"/>
+          <w:szCs w:val="24"/>
+          <w:lang w:val="es-MX"/>
+        </w:rPr>
+      </w:pPr>
+      <w:r>
+        <w:rPr>
+          <w:rFonts w:ascii="Times New Roman" w:eastAsia="Times New Roman" w:hAnsi="Times New Roman" w:cs="Times New Roman"/>
+          <w:b/>
+          <w:bCs/>
+          <w:color w:val="002060"/>
+          <w:sz w:val="28"/>
+          <w:szCs w:val="28"/>
+          <w:lang w:val="es-MX"/>
+        </w:rPr>
+        <w:t xml:space="preserve">PROFESOR: MITC. Alejandro Ulises López Orozco </w:t>
+      </w:r>
+    </w:p>
+    <w:p>
+      <w:pPr>
+        <w:tabs>
+          <w:tab w:val="left" w:pos="4986"/>
+        </w:tabs>
+        <w:spacing w:after="240" w:line="240" w:lineRule="auto"/>
+        <w:rPr>
+          <w:rFonts w:ascii="Times New Roman" w:eastAsia="Times New Roman" w:hAnsi="Times New Roman" w:cs="Times New Roman"/>
+          <w:sz w:val="24"/>
+          <w:szCs w:val="24"/>
+          <w:lang w:val="es-MX"/>
+        </w:rPr>
+      </w:pPr>
+      <w:r>
+        <w:rPr>
+          <w:rFonts w:ascii="Times New Roman" w:eastAsia="Times New Roman" w:hAnsi="Times New Roman" w:cs="Times New Roman"/>
+          <w:sz w:val="24"/>
+          <w:szCs w:val="24"/>
+          <w:lang w:val="es-MX"/>
+        </w:rPr>
+        <w:tab/>
+      </w:r>
+    </w:p>
+    <w:p>
+      <w:pPr>
+        <w:tabs>
+          <w:tab w:val="left" w:pos="4986"/>
+        </w:tabs>
+        <w:spacing w:after="240" w:line="240" w:lineRule="auto"/>
+        <w:rPr>
+          <w:rFonts w:ascii="Times New Roman" w:eastAsia="Times New Roman" w:hAnsi="Times New Roman" w:cs="Times New Roman"/>
+          <w:sz w:val="24"/>
+          <w:szCs w:val="24"/>
+          <w:lang w:val="es-MX"/>
+        </w:rPr>
+      </w:pPr>
+    </w:p>
+    <w:p>
+      <w:pPr>
+        <w:spacing w:line="240" w:lineRule="auto"/>
+        <w:jc w:val="center"/>
+        <w:rPr>
+          <w:rFonts w:ascii="Times New Roman" w:eastAsia="Times New Roman" w:hAnsi="Times New Roman" w:cs="Times New Roman"/>
+          <w:sz w:val="24"/>
+          <w:szCs w:val="24"/>
+          <w:lang w:val="es-MX"/>
+        </w:rPr>
+      </w:pPr>
+      <w:r>
+        <w:rPr>
+          <w:rFonts w:ascii="Times New Roman" w:eastAsia="Times New Roman" w:hAnsi="Times New Roman" w:cs="Times New Roman"/>
+          <w:b/>
+          <w:bCs/>
+          <w:color w:val="002060"/>
+          <w:sz w:val="28"/>
+          <w:szCs w:val="28"/>
+          <w:lang w:val="es-MX"/>
+        </w:rPr>
+        <w:t>FECHA DE ENTREGA: </w:t>
+      </w:r>
+    </w:p>
+    <w:p>
+      <w:pPr>
+        <w:spacing w:line="240" w:lineRule="auto"/>
+        <w:jc w:val="center"/>
+        <w:rPr>
+          <w:rFonts w:ascii="Times New Roman" w:eastAsia="Times New Roman" w:hAnsi="Times New Roman" w:cs="Times New Roman"/>
+          <w:sz w:val="24"/>
+          <w:szCs w:val="24"/>
+          <w:lang w:val="es-MX"/>
+        </w:rPr>
+      </w:pPr>
+      <w:r>
+        <w:rPr>
+          <w:rFonts w:ascii="Times New Roman" w:eastAsia="Times New Roman" w:hAnsi="Times New Roman" w:cs="Times New Roman"/>
+          <w:b/>
+          <w:bCs/>
+          <w:color w:val="002060"/>
+          <w:sz w:val="28"/>
+          <w:szCs w:val="28"/>
+          <w:lang w:val="es-MX"/>
+        </w:rPr>
+        <w:t xml:space="preserve">JALPA, ZACATECAS A </w:t>
+      </w:r>
+      <w:r>
+        <w:rPr>
+          <w:rFonts w:ascii="Times New Roman" w:eastAsia="Times New Roman" w:hAnsi="Times New Roman" w:cs="Times New Roman"/>
+          <w:b/>
+          <w:bCs/>
+          <w:color w:val="002060"/>
+          <w:sz w:val="28"/>
+          <w:szCs w:val="28"/>
+          <w:lang w:val="es-MX"/>
+        </w:rPr>
+        <w:t>14</w:t>
+      </w:r>
+      <w:r>
+        <w:rPr>
+          <w:rFonts w:ascii="Times New Roman" w:eastAsia="Times New Roman" w:hAnsi="Times New Roman" w:cs="Times New Roman"/>
+          <w:b/>
+          <w:bCs/>
+          <w:color w:val="002060"/>
+          <w:sz w:val="28"/>
+          <w:szCs w:val="28"/>
+          <w:lang w:val="es-MX"/>
+        </w:rPr>
+        <w:t xml:space="preserve"> DE SEPTIEMBRE DEL 2026</w:t>
+      </w:r>
+    </w:p>
+    <w:p>
+      <w:pPr>
         <w:rPr>
           <w:b/>
           <w:sz w:val="44"/>
           <w:lang w:val="es-MX"/>
         </w:rPr>
+      </w:pPr>
+    </w:p>
+    <w:p>
+      <w:pPr>
+        <w:rPr>
+          <w:b/>
+          <w:sz w:val="44"/>
+          <w:lang w:val="es-MX"/>
+        </w:rPr>
+      </w:pPr>
+    </w:p>
+    <w:p>
+      <w:pPr>
+        <w:jc w:val="center"/>
+        <w:rPr>
+          <w:lang w:val="es-MX"/>
+        </w:rPr>
+      </w:pPr>
+      <w:r>
+        <w:rPr>
+          <w:b/>
+          <w:sz w:val="44"/>
+          <w:lang w:val="es-MX"/>
+        </w:rPr>
+        <w:lastRenderedPageBreak/>
         <w:t>Laboratorio: El sitio Web está roto (</w:t>
       </w:r>
       <w:proofErr w:type="spellStart"/>
@@ -3321,13 +4163,7 @@
               <w:rPr>
                 <w:lang w:val="es-MX"/>
               </w:rPr>
-              <w:t>carrera</w:t>
-            </w:r>
-            <w:r>
-              <w:rPr>
-                <w:lang w:val="es-MX"/>
-              </w:rPr>
-              <w:t>.html</w:t>
+              <w:t>carrera.html</w:t>
             </w:r>
           </w:p>
         </w:tc>
@@ -3545,7 +4381,13 @@
               <w:rPr>
                 <w:lang w:val="es-MX"/>
               </w:rPr>
-              <w:t>Index.html</w:t>
+              <w:t>carrera</w:t>
+            </w:r>
+            <w:r>
+              <w:rPr>
+                <w:lang w:val="es-MX"/>
+              </w:rPr>
+              <w:t>.html</w:t>
             </w:r>
           </w:p>
         </w:tc>
@@ -3559,11 +4401,19 @@
                 <w:lang w:val="es-MX"/>
               </w:rPr>
             </w:pPr>
-            <w:r>
-              <w:rPr>
-                <w:lang w:val="es-MX"/>
-              </w:rPr>
-              <w:t xml:space="preserve">carrera.html </w:t>
+            <w:proofErr w:type="spellStart"/>
+            <w:r>
+              <w:rPr>
+                <w:lang w:val="es-MX"/>
+              </w:rPr>
+              <w:t>img</w:t>
+            </w:r>
+            <w:proofErr w:type="spellEnd"/>
+            <w:r>
+              <w:rPr>
+                <w:lang w:val="es-MX"/>
+              </w:rPr>
+              <w:t>/campus.jpg</w:t>
             </w:r>
           </w:p>
         </w:tc>
@@ -3577,19 +4427,25 @@
                 <w:lang w:val="es-MX"/>
               </w:rPr>
             </w:pPr>
+            <w:r>
+              <w:rPr>
+                <w:lang w:val="es-MX"/>
+              </w:rPr>
+              <w:t>../</w:t>
+            </w:r>
             <w:proofErr w:type="spellStart"/>
             <w:r>
               <w:rPr>
                 <w:lang w:val="es-MX"/>
               </w:rPr>
-              <w:t>pages</w:t>
+              <w:t>img</w:t>
             </w:r>
             <w:proofErr w:type="spellEnd"/>
             <w:r>
               <w:rPr>
                 <w:lang w:val="es-MX"/>
               </w:rPr>
-              <w:t>/carrera.html</w:t>
+              <w:t>/campus.jpg</w:t>
             </w:r>
           </w:p>
         </w:tc>
@@ -3625,7 +4481,7 @@
               <w:rPr>
                 <w:lang w:val="es-MX"/>
               </w:rPr>
-              <w:t xml:space="preserve">carrera.html se encuentra dentro de </w:t>
+              <w:t xml:space="preserve">Se necesita salir del apartado </w:t>
             </w:r>
             <w:proofErr w:type="spellStart"/>
             <w:r>
@@ -3639,7 +4495,21 @@
               <w:rPr>
                 <w:lang w:val="es-MX"/>
               </w:rPr>
-              <w:t xml:space="preserve"> no fuera</w:t>
+              <w:t xml:space="preserve"> para entrar a la carpeta </w:t>
+            </w:r>
+            <w:proofErr w:type="spellStart"/>
+            <w:r>
+              <w:rPr>
+                <w:lang w:val="es-MX"/>
+              </w:rPr>
+              <w:t>img</w:t>
+            </w:r>
+            <w:proofErr w:type="spellEnd"/>
+            <w:r>
+              <w:rPr>
+                <w:lang w:val="es-MX"/>
+              </w:rPr>
+              <w:t xml:space="preserve"> correcta </w:t>
             </w:r>
           </w:p>
         </w:tc>
@@ -3662,7 +4532,7 @@
               <w:rPr>
                 <w:lang w:val="es-MX"/>
               </w:rPr>
-              <w:t>Index.html</w:t>
+              <w:t>carrera.html</w:t>
             </w:r>
           </w:p>
           <w:p>
@@ -3697,11 +4567,19 @@
                 <w:lang w:val="es-MX"/>
               </w:rPr>
             </w:pPr>
-            <w:r>
-              <w:rPr>
-                <w:lang w:val="es-MX"/>
-              </w:rPr>
-              <w:t>/docentes.html</w:t>
+            <w:proofErr w:type="spellStart"/>
+            <w:r>
+              <w:rPr>
+                <w:lang w:val="es-MX"/>
+              </w:rPr>
+              <w:t>docs</w:t>
+            </w:r>
+            <w:proofErr w:type="spellEnd"/>
+            <w:r>
+              <w:rPr>
+                <w:lang w:val="es-MX"/>
+              </w:rPr>
+              <w:t>/plan-estudios.pdf</w:t>
             </w:r>
           </w:p>
           <w:p>
@@ -3736,27 +4614,34 @@
                 <w:lang w:val="es-MX"/>
               </w:rPr>
             </w:pPr>
+            <w:r>
+              <w:rPr>
+                <w:lang w:val="es-MX"/>
+              </w:rPr>
+              <w:t>“../</w:t>
+            </w:r>
             <w:proofErr w:type="spellStart"/>
             <w:r>
               <w:rPr>
                 <w:lang w:val="es-MX"/>
               </w:rPr>
-              <w:t>pages</w:t>
+              <w:t>docs</w:t>
             </w:r>
             <w:proofErr w:type="spellEnd"/>
             <w:r>
               <w:rPr>
                 <w:lang w:val="es-MX"/>
               </w:rPr>
-              <w:t>/docentes.html</w:t>
-            </w:r>
-          </w:p>
-          <w:p>
-            <w:pPr>
-              <w:rPr>
-                <w:lang w:val="es-MX"/>
-              </w:rPr>
-            </w:pPr>
+              <w:t xml:space="preserve">/plan-estudios.pdf” </w:t>
+            </w:r>
+            <w:proofErr w:type="spellStart"/>
+            <w:r>
+              <w:rPr>
+                <w:lang w:val="es-MX"/>
+              </w:rPr>
+              <w:t>download</w:t>
+            </w:r>
+            <w:proofErr w:type="spellEnd"/>
           </w:p>
           <w:p>
             <w:pPr>
@@ -3805,21 +4690,21 @@
               <w:rPr>
                 <w:lang w:val="es-MX"/>
               </w:rPr>
-              <w:t xml:space="preserve">docentes.html </w:t>
+              <w:t xml:space="preserve">Esta faltando el atributo </w:t>
             </w:r>
             <w:proofErr w:type="spellStart"/>
             <w:r>
               <w:rPr>
                 <w:lang w:val="es-MX"/>
               </w:rPr>
-              <w:t>esta</w:t>
+              <w:t>download</w:t>
             </w:r>
             <w:proofErr w:type="spellEnd"/>
             <w:r>
               <w:rPr>
                 <w:lang w:val="es-MX"/>
               </w:rPr>
-              <w:t xml:space="preserve"> dentro de </w:t>
+              <w:t xml:space="preserve">, al igual se necesita salir de </w:t>
             </w:r>
             <w:proofErr w:type="spellStart"/>
             <w:r>
@@ -3850,7 +4735,7 @@
               <w:rPr>
                 <w:lang w:val="es-MX"/>
               </w:rPr>
-              <w:t xml:space="preserve">Index.html </w:t>
+              <w:t>carrera.html</w:t>
             </w:r>
           </w:p>
         </w:tc>
@@ -3864,11 +4749,19 @@
                 <w:lang w:val="es-MX"/>
               </w:rPr>
             </w:pPr>
-            <w:r>
-              <w:rPr>
-                <w:lang w:val="es-MX"/>
-              </w:rPr>
-              <w:t>logo.png</w:t>
+            <w:proofErr w:type="spellStart"/>
+            <w:r>
+              <w:rPr>
+                <w:lang w:val="es-MX"/>
+              </w:rPr>
+              <w:t>css</w:t>
+            </w:r>
+            <w:proofErr w:type="spellEnd"/>
+            <w:r>
+              <w:rPr>
+                <w:lang w:val="es-MX"/>
+              </w:rPr>
+              <w:t>/estilos.css</w:t>
             </w:r>
           </w:p>
         </w:tc>
@@ -3882,19 +4775,25 @@
                 <w:lang w:val="es-MX"/>
               </w:rPr>
             </w:pPr>
+            <w:r>
+              <w:rPr>
+                <w:lang w:val="es-MX"/>
+              </w:rPr>
+              <w:t>../</w:t>
+            </w:r>
             <w:proofErr w:type="spellStart"/>
             <w:r>
               <w:rPr>
                 <w:lang w:val="es-MX"/>
               </w:rPr>
-              <w:t>img</w:t>
+              <w:t>css</w:t>
             </w:r>
             <w:proofErr w:type="spellEnd"/>
             <w:r>
               <w:rPr>
                 <w:lang w:val="es-MX"/>
               </w:rPr>
-              <w:t>/logo.png</w:t>
+              <w:t>/estilos.css</w:t>
             </w:r>
           </w:p>
         </w:tc>
@@ -3930,42 +4829,185 @@
               <w:rPr>
                 <w:lang w:val="es-MX"/>
               </w:rPr>
-              <w:t xml:space="preserve">Lo estaba marcando como fuera de la </w:t>
+              <w:t xml:space="preserve">Hace falta salir a la raíz para poder </w:t>
             </w:r>
             <w:r>
               <w:rPr>
                 <w:lang w:val="es-MX"/>
               </w:rPr>
               <w:lastRenderedPageBreak/>
-              <w:t xml:space="preserve">carpeta </w:t>
-            </w:r>
-            <w:proofErr w:type="spellStart"/>
-            <w:r>
-              <w:rPr>
-                <w:lang w:val="es-MX"/>
-              </w:rPr>
-              <w:t>img</w:t>
-            </w:r>
-            <w:proofErr w:type="spellEnd"/>
-            <w:r>
-              <w:rPr>
-                <w:lang w:val="es-MX"/>
-              </w:rPr>
-              <w:t xml:space="preserve"> y </w:t>
-            </w:r>
-            <w:proofErr w:type="spellStart"/>
-            <w:r>
-              <w:rPr>
-                <w:lang w:val="es-MX"/>
-              </w:rPr>
-              <w:t>esta</w:t>
-            </w:r>
-            <w:proofErr w:type="spellEnd"/>
-            <w:r>
-              <w:rPr>
-                <w:lang w:val="es-MX"/>
-              </w:rPr>
-              <w:t xml:space="preserve"> dentro</w:t>
+              <w:t>entrar a donde corresponde</w:t>
+            </w:r>
+          </w:p>
+        </w:tc>
+      </w:tr>
+    </w:tbl>
+    <w:p>
+      <w:pPr>
+        <w:rPr>
+          <w:lang w:val="es-MX"/>
+        </w:rPr>
+      </w:pPr>
+    </w:p>
+    <w:p>
+      <w:pPr>
+        <w:pStyle w:val="Ttulo1"/>
+        <w:rPr>
+          <w:rFonts w:ascii="Arial" w:hAnsi="Arial"/>
+          <w:color w:val="auto"/>
+          <w:lang w:val="es-MX"/>
+        </w:rPr>
+      </w:pPr>
+      <w:r>
+        <w:rPr>
+          <w:rFonts w:ascii="Arial" w:hAnsi="Arial"/>
+          <w:color w:val="auto"/>
+          <w:lang w:val="es-MX"/>
+        </w:rPr>
+        <w:t xml:space="preserve">Tabla de </w:t>
+      </w:r>
+      <w:r>
+        <w:rPr>
+          <w:rFonts w:ascii="Arial" w:hAnsi="Arial"/>
+          <w:color w:val="auto"/>
+          <w:lang w:val="es-MX"/>
+        </w:rPr>
+        <w:t>evento</w:t>
+      </w:r>
+      <w:r>
+        <w:rPr>
+          <w:rFonts w:ascii="Arial" w:hAnsi="Arial"/>
+          <w:color w:val="auto"/>
+          <w:lang w:val="es-MX"/>
+        </w:rPr>
+        <w:t>.html</w:t>
+      </w:r>
+    </w:p>
+    <w:p>
+      <w:pPr>
+        <w:rPr>
+          <w:lang w:val="es-MX"/>
+        </w:rPr>
+      </w:pPr>
+    </w:p>
+    <w:tbl>
+      <w:tblPr>
+        <w:tblW w:w="10225" w:type="dxa"/>
+        <w:jc w:val="center"/>
+        <w:tblBorders>
+          <w:top w:val="single" w:sz="4" w:space="0" w:color="auto"/>
+          <w:left w:val="single" w:sz="4" w:space="0" w:color="auto"/>
+          <w:bottom w:val="single" w:sz="4" w:space="0" w:color="auto"/>
+          <w:right w:val="single" w:sz="4" w:space="0" w:color="auto"/>
+          <w:insideH w:val="single" w:sz="4" w:space="0" w:color="auto"/>
+          <w:insideV w:val="single" w:sz="4" w:space="0" w:color="auto"/>
+        </w:tblBorders>
+        <w:tblLayout w:type="fixed"/>
+        <w:tblLook w:val="04A0" w:firstRow="1" w:lastRow="0" w:firstColumn="1" w:lastColumn="0" w:noHBand="0" w:noVBand="1"/>
+      </w:tblPr>
+      <w:tblGrid>
+        <w:gridCol w:w="2045"/>
+        <w:gridCol w:w="2045"/>
+        <w:gridCol w:w="2045"/>
+        <w:gridCol w:w="2045"/>
+        <w:gridCol w:w="2045"/>
+      </w:tblGrid>
+      <w:tr>
+        <w:trPr>
+          <w:jc w:val="center"/>
+        </w:trPr>
+        <w:tc>
+          <w:tcPr>
+            <w:tcW w:w="2045" w:type="dxa"/>
+            <w:shd w:val="clear" w:color="auto" w:fill="D9EAF7"/>
+          </w:tcPr>
+          <w:p>
+            <w:pPr>
+              <w:rPr>
+                <w:lang w:val="es-MX"/>
+              </w:rPr>
+            </w:pPr>
+            <w:r>
+              <w:rPr>
+                <w:lang w:val="es-MX"/>
+              </w:rPr>
+              <w:t>Archivo</w:t>
+            </w:r>
+          </w:p>
+        </w:tc>
+        <w:tc>
+          <w:tcPr>
+            <w:tcW w:w="2045" w:type="dxa"/>
+            <w:shd w:val="clear" w:color="auto" w:fill="D9EAF7"/>
+          </w:tcPr>
+          <w:p>
+            <w:pPr>
+              <w:rPr>
+                <w:lang w:val="es-MX"/>
+              </w:rPr>
+            </w:pPr>
+            <w:r>
+              <w:rPr>
+                <w:lang w:val="es-MX"/>
+              </w:rPr>
+              <w:t>Ruta incorrecta</w:t>
+            </w:r>
+          </w:p>
+        </w:tc>
+        <w:tc>
+          <w:tcPr>
+            <w:tcW w:w="2045" w:type="dxa"/>
+            <w:shd w:val="clear" w:color="auto" w:fill="D9EAF7"/>
+          </w:tcPr>
+          <w:p>
+            <w:pPr>
+              <w:rPr>
+                <w:lang w:val="es-MX"/>
+              </w:rPr>
+            </w:pPr>
+            <w:r>
+              <w:rPr>
+                <w:lang w:val="es-MX"/>
+              </w:rPr>
+              <w:t>Ruta corregida</w:t>
+            </w:r>
+          </w:p>
+        </w:tc>
+        <w:tc>
+          <w:tcPr>
+            <w:tcW w:w="2045" w:type="dxa"/>
+            <w:shd w:val="clear" w:color="auto" w:fill="D9EAF7"/>
+          </w:tcPr>
+          <w:p>
+            <w:pPr>
+              <w:rPr>
+                <w:lang w:val="es-MX"/>
+              </w:rPr>
+            </w:pPr>
+            <w:r>
+              <w:rPr>
+                <w:lang w:val="es-MX"/>
+              </w:rPr>
+              <w:t>Tipo</w:t>
+            </w:r>
+          </w:p>
+        </w:tc>
+        <w:tc>
+          <w:tcPr>
+            <w:tcW w:w="2045" w:type="dxa"/>
+            <w:shd w:val="clear" w:color="auto" w:fill="D9EAF7"/>
+          </w:tcPr>
+          <w:p>
+            <w:pPr>
+              <w:rPr>
+                <w:lang w:val="es-MX"/>
+              </w:rPr>
+            </w:pPr>
+            <w:r>
+              <w:rPr>
+                <w:lang w:val="es-MX"/>
+              </w:rPr>
+              <w:t>Justificación</w:t>
             </w:r>
           </w:p>
         </w:tc>
@@ -3988,8 +5030,13 @@
               <w:rPr>
                 <w:lang w:val="es-MX"/>
               </w:rPr>
-              <w:lastRenderedPageBreak/>
-              <w:t xml:space="preserve">Index.html </w:t>
+              <w:t>evento</w:t>
+            </w:r>
+            <w:r>
+              <w:rPr>
+                <w:lang w:val="es-MX"/>
+              </w:rPr>
+              <w:t>.html</w:t>
             </w:r>
           </w:p>
         </w:tc>
@@ -4003,19 +5050,25 @@
                 <w:lang w:val="es-MX"/>
               </w:rPr>
             </w:pPr>
+            <w:r>
+              <w:rPr>
+                <w:lang w:val="es-MX"/>
+              </w:rPr>
+              <w:t>../</w:t>
+            </w:r>
             <w:proofErr w:type="spellStart"/>
             <w:r>
               <w:rPr>
                 <w:lang w:val="es-MX"/>
               </w:rPr>
-              <w:t>docs</w:t>
+              <w:t>css</w:t>
             </w:r>
             <w:proofErr w:type="spellEnd"/>
             <w:r>
               <w:rPr>
                 <w:lang w:val="es-MX"/>
               </w:rPr>
-              <w:t>/plan-estudio.pdf</w:t>
+              <w:t>/estilos.css</w:t>
             </w:r>
           </w:p>
         </w:tc>
@@ -4033,30 +5086,28 @@
               <w:rPr>
                 <w:lang w:val="es-MX"/>
               </w:rPr>
-              <w:t>“</w:t>
+              <w:t>../</w:t>
+            </w:r>
+            <w:r>
+              <w:rPr>
+                <w:lang w:val="es-MX"/>
+              </w:rPr>
+              <w:t>../</w:t>
             </w:r>
             <w:proofErr w:type="spellStart"/>
             <w:r>
               <w:rPr>
                 <w:lang w:val="es-MX"/>
               </w:rPr>
-              <w:t>docs</w:t>
+              <w:t>css</w:t>
             </w:r>
             <w:proofErr w:type="spellEnd"/>
             <w:r>
               <w:rPr>
                 <w:lang w:val="es-MX"/>
               </w:rPr>
-              <w:t xml:space="preserve">/plan-estudios.pdf” </w:t>
-            </w:r>
-            <w:proofErr w:type="spellStart"/>
-            <w:r>
-              <w:rPr>
-                <w:lang w:val="es-MX"/>
-              </w:rPr>
-              <w:t>download</w:t>
-            </w:r>
-            <w:proofErr w:type="spellEnd"/>
+              <w:t>/estilos.css</w:t>
+            </w:r>
           </w:p>
         </w:tc>
         <w:tc>
@@ -4091,49 +5142,7 @@
               <w:rPr>
                 <w:lang w:val="es-MX"/>
               </w:rPr>
-              <w:t xml:space="preserve">El nombre </w:t>
-            </w:r>
-            <w:proofErr w:type="spellStart"/>
-            <w:r>
-              <w:rPr>
-                <w:lang w:val="es-MX"/>
-              </w:rPr>
-              <w:t>de el</w:t>
-            </w:r>
-            <w:proofErr w:type="spellEnd"/>
-            <w:r>
-              <w:rPr>
-                <w:lang w:val="es-MX"/>
-              </w:rPr>
-              <w:t xml:space="preserve"> </w:t>
-            </w:r>
-            <w:proofErr w:type="spellStart"/>
-            <w:r>
-              <w:rPr>
-                <w:lang w:val="es-MX"/>
-              </w:rPr>
-              <w:t>pdf</w:t>
-            </w:r>
-            <w:proofErr w:type="spellEnd"/>
-            <w:r>
-              <w:rPr>
-                <w:lang w:val="es-MX"/>
-              </w:rPr>
-              <w:t xml:space="preserve"> le faltaba una letra y también agregar el atributo </w:t>
-            </w:r>
-            <w:proofErr w:type="spellStart"/>
-            <w:r>
-              <w:rPr>
-                <w:lang w:val="es-MX"/>
-              </w:rPr>
-              <w:t>download</w:t>
-            </w:r>
-            <w:proofErr w:type="spellEnd"/>
-            <w:r>
-              <w:rPr>
-                <w:lang w:val="es-MX"/>
-              </w:rPr>
-              <w:t>.</w:t>
+              <w:t>Hace falta salir una carpeta mas para estar en la raíz y poder entrar a estilos</w:t>
             </w:r>
           </w:p>
         </w:tc>
@@ -4156,7 +5165,7 @@
               <w:rPr>
                 <w:lang w:val="es-MX"/>
               </w:rPr>
-              <w:t>Index.html</w:t>
+              <w:t>evento.html</w:t>
             </w:r>
           </w:p>
         </w:tc>
@@ -4174,7 +5183,7 @@
               <w:rPr>
                 <w:lang w:val="es-MX"/>
               </w:rPr>
-              <w:t>developer.mozilla.org</w:t>
+              <w:t>../index.html</w:t>
             </w:r>
           </w:p>
         </w:tc>
@@ -4192,7 +5201,13 @@
               <w:rPr>
                 <w:lang w:val="es-MX"/>
               </w:rPr>
-              <w:t>https://developer.mozilla.org</w:t>
+              <w:t>../</w:t>
+            </w:r>
+            <w:r>
+              <w:rPr>
+                <w:lang w:val="es-MX"/>
+              </w:rPr>
+              <w:t>../index.html</w:t>
             </w:r>
           </w:p>
         </w:tc>
@@ -4210,7 +5225,7 @@
               <w:rPr>
                 <w:lang w:val="es-MX"/>
               </w:rPr>
-              <w:t>Absoluta</w:t>
+              <w:t>Relativa</w:t>
             </w:r>
           </w:p>
         </w:tc>
@@ -4228,16 +5243,659 @@
               <w:rPr>
                 <w:lang w:val="es-MX"/>
               </w:rPr>
-              <w:t xml:space="preserve">Como developer.mozilla.org hace referencia a un enlace externo le falta los atributos target y </w:t>
+              <w:t xml:space="preserve">Se necesita salir a la </w:t>
+            </w:r>
+            <w:r>
+              <w:rPr>
+                <w:lang w:val="es-MX"/>
+              </w:rPr>
+              <w:t xml:space="preserve">raíz y no quedarse en </w:t>
             </w:r>
             <w:proofErr w:type="spellStart"/>
             <w:r>
               <w:rPr>
                 <w:lang w:val="es-MX"/>
               </w:rPr>
+              <w:t>pages</w:t>
+            </w:r>
+            <w:proofErr w:type="spellEnd"/>
+          </w:p>
+        </w:tc>
+      </w:tr>
+      <w:tr>
+        <w:trPr>
+          <w:jc w:val="center"/>
+        </w:trPr>
+        <w:tc>
+          <w:tcPr>
+            <w:tcW w:w="2045" w:type="dxa"/>
+          </w:tcPr>
+          <w:p>
+            <w:pPr>
+              <w:rPr>
+                <w:lang w:val="es-MX"/>
+              </w:rPr>
+            </w:pPr>
+            <w:r>
+              <w:rPr>
+                <w:lang w:val="es-MX"/>
+              </w:rPr>
+              <w:t>evento.html</w:t>
+            </w:r>
+          </w:p>
+        </w:tc>
+        <w:tc>
+          <w:tcPr>
+            <w:tcW w:w="2045" w:type="dxa"/>
+          </w:tcPr>
+          <w:p>
+            <w:pPr>
+              <w:rPr>
+                <w:lang w:val="es-MX"/>
+              </w:rPr>
+            </w:pPr>
+            <w:r>
+              <w:rPr>
+                <w:lang w:val="es-MX"/>
+              </w:rPr>
+              <w:t>../</w:t>
+            </w:r>
+            <w:proofErr w:type="spellStart"/>
+            <w:r>
+              <w:rPr>
+                <w:lang w:val="es-MX"/>
+              </w:rPr>
+              <w:t>img</w:t>
+            </w:r>
+            <w:proofErr w:type="spellEnd"/>
+            <w:r>
+              <w:rPr>
+                <w:lang w:val="es-MX"/>
+              </w:rPr>
+              <w:t>/campus.jpg</w:t>
+            </w:r>
+          </w:p>
+        </w:tc>
+        <w:tc>
+          <w:tcPr>
+            <w:tcW w:w="2045" w:type="dxa"/>
+          </w:tcPr>
+          <w:p>
+            <w:pPr>
+              <w:rPr>
+                <w:lang w:val="es-MX"/>
+              </w:rPr>
+            </w:pPr>
+            <w:r>
+              <w:rPr>
+                <w:lang w:val="es-MX"/>
+              </w:rPr>
+              <w:t>../</w:t>
+            </w:r>
+            <w:r>
+              <w:rPr>
+                <w:lang w:val="es-MX"/>
+              </w:rPr>
+              <w:t>../</w:t>
+            </w:r>
+            <w:proofErr w:type="spellStart"/>
+            <w:r>
+              <w:rPr>
+                <w:lang w:val="es-MX"/>
+              </w:rPr>
+              <w:t>img</w:t>
+            </w:r>
+            <w:proofErr w:type="spellEnd"/>
+            <w:r>
+              <w:rPr>
+                <w:lang w:val="es-MX"/>
+              </w:rPr>
+              <w:t>/campus.jpg</w:t>
+            </w:r>
+          </w:p>
+        </w:tc>
+        <w:tc>
+          <w:tcPr>
+            <w:tcW w:w="2045" w:type="dxa"/>
+          </w:tcPr>
+          <w:p>
+            <w:pPr>
+              <w:rPr>
+                <w:lang w:val="es-MX"/>
+              </w:rPr>
+            </w:pPr>
+            <w:r>
+              <w:rPr>
+                <w:lang w:val="es-MX"/>
+              </w:rPr>
+              <w:t>Relativa</w:t>
+            </w:r>
+          </w:p>
+        </w:tc>
+        <w:tc>
+          <w:tcPr>
+            <w:tcW w:w="2045" w:type="dxa"/>
+          </w:tcPr>
+          <w:p>
+            <w:pPr>
+              <w:rPr>
+                <w:lang w:val="es-MX"/>
+              </w:rPr>
+            </w:pPr>
+            <w:r>
+              <w:rPr>
+                <w:lang w:val="es-MX"/>
+              </w:rPr>
+              <w:t xml:space="preserve">Se necesita salir hasta la raíz para poder entrar a </w:t>
+            </w:r>
+            <w:proofErr w:type="spellStart"/>
+            <w:r>
+              <w:rPr>
+                <w:lang w:val="es-MX"/>
+              </w:rPr>
+              <w:t>img</w:t>
+            </w:r>
+            <w:proofErr w:type="spellEnd"/>
+            <w:r>
+              <w:rPr>
+                <w:lang w:val="es-MX"/>
+              </w:rPr>
+              <w:t xml:space="preserve"> </w:t>
+            </w:r>
+          </w:p>
+        </w:tc>
+      </w:tr>
+      <w:tr>
+        <w:trPr>
+          <w:jc w:val="center"/>
+        </w:trPr>
+        <w:tc>
+          <w:tcPr>
+            <w:tcW w:w="2045" w:type="dxa"/>
+          </w:tcPr>
+          <w:p>
+            <w:pPr>
+              <w:rPr>
+                <w:lang w:val="es-MX"/>
+              </w:rPr>
+            </w:pPr>
+            <w:r>
+              <w:rPr>
+                <w:lang w:val="es-MX"/>
+              </w:rPr>
+              <w:t>evento</w:t>
+            </w:r>
+            <w:r>
+              <w:rPr>
+                <w:lang w:val="es-MX"/>
+              </w:rPr>
+              <w:t>.html</w:t>
+            </w:r>
+          </w:p>
+          <w:p>
+            <w:pPr>
+              <w:rPr>
+                <w:lang w:val="es-MX"/>
+              </w:rPr>
+            </w:pPr>
+          </w:p>
+          <w:p>
+            <w:pPr>
+              <w:rPr>
+                <w:lang w:val="es-MX"/>
+              </w:rPr>
+            </w:pPr>
+          </w:p>
+          <w:p>
+            <w:pPr>
+              <w:rPr>
+                <w:lang w:val="es-MX"/>
+              </w:rPr>
+            </w:pPr>
+          </w:p>
+        </w:tc>
+        <w:tc>
+          <w:tcPr>
+            <w:tcW w:w="2045" w:type="dxa"/>
+          </w:tcPr>
+          <w:p>
+            <w:pPr>
+              <w:rPr>
+                <w:lang w:val="es-MX"/>
+              </w:rPr>
+            </w:pPr>
+            <w:r>
+              <w:rPr>
+                <w:lang w:val="es-MX"/>
+              </w:rPr>
+              <w:t>../</w:t>
+            </w:r>
+            <w:proofErr w:type="spellStart"/>
+            <w:r>
+              <w:rPr>
+                <w:lang w:val="es-MX"/>
+              </w:rPr>
+              <w:t>docs</w:t>
+            </w:r>
+            <w:proofErr w:type="spellEnd"/>
+            <w:r>
+              <w:rPr>
+                <w:lang w:val="es-MX"/>
+              </w:rPr>
+              <w:t>/plan-estudios.pdf</w:t>
+            </w:r>
+          </w:p>
+          <w:p>
+            <w:pPr>
+              <w:rPr>
+                <w:lang w:val="es-MX"/>
+              </w:rPr>
+            </w:pPr>
+          </w:p>
+          <w:p>
+            <w:pPr>
+              <w:rPr>
+                <w:lang w:val="es-MX"/>
+              </w:rPr>
+            </w:pPr>
+          </w:p>
+          <w:p>
+            <w:pPr>
+              <w:rPr>
+                <w:lang w:val="es-MX"/>
+              </w:rPr>
+            </w:pPr>
+          </w:p>
+        </w:tc>
+        <w:tc>
+          <w:tcPr>
+            <w:tcW w:w="2045" w:type="dxa"/>
+          </w:tcPr>
+          <w:p>
+            <w:pPr>
+              <w:rPr>
+                <w:lang w:val="es-MX"/>
+              </w:rPr>
+            </w:pPr>
+            <w:r>
+              <w:rPr>
+                <w:lang w:val="es-MX"/>
+              </w:rPr>
+              <w:t>“</w:t>
+            </w:r>
+            <w:r>
+              <w:rPr>
+                <w:lang w:val="es-MX"/>
+              </w:rPr>
+              <w:t>../</w:t>
+            </w:r>
+            <w:r>
+              <w:rPr>
+                <w:lang w:val="es-MX"/>
+              </w:rPr>
+              <w:t>../</w:t>
+            </w:r>
+            <w:proofErr w:type="spellStart"/>
+            <w:r>
+              <w:rPr>
+                <w:lang w:val="es-MX"/>
+              </w:rPr>
+              <w:t>docs</w:t>
+            </w:r>
+            <w:proofErr w:type="spellEnd"/>
+            <w:r>
+              <w:rPr>
+                <w:lang w:val="es-MX"/>
+              </w:rPr>
+              <w:t xml:space="preserve">/plan-estudios.pdf” </w:t>
+            </w:r>
+            <w:proofErr w:type="spellStart"/>
+            <w:r>
+              <w:rPr>
+                <w:lang w:val="es-MX"/>
+              </w:rPr>
+              <w:t>download</w:t>
+            </w:r>
+            <w:proofErr w:type="spellEnd"/>
+          </w:p>
+          <w:p>
+            <w:pPr>
+              <w:rPr>
+                <w:lang w:val="es-MX"/>
+              </w:rPr>
+            </w:pPr>
+          </w:p>
+          <w:p>
+            <w:pPr>
+              <w:rPr>
+                <w:lang w:val="es-MX"/>
+              </w:rPr>
+            </w:pPr>
+          </w:p>
+        </w:tc>
+        <w:tc>
+          <w:tcPr>
+            <w:tcW w:w="2045" w:type="dxa"/>
+          </w:tcPr>
+          <w:p>
+            <w:pPr>
+              <w:rPr>
+                <w:lang w:val="es-MX"/>
+              </w:rPr>
+            </w:pPr>
+            <w:r>
+              <w:rPr>
+                <w:lang w:val="es-MX"/>
+              </w:rPr>
+              <w:t xml:space="preserve">Relativa </w:t>
+            </w:r>
+          </w:p>
+        </w:tc>
+        <w:tc>
+          <w:tcPr>
+            <w:tcW w:w="2045" w:type="dxa"/>
+          </w:tcPr>
+          <w:p>
+            <w:pPr>
+              <w:rPr>
+                <w:lang w:val="es-MX"/>
+              </w:rPr>
+            </w:pPr>
+            <w:r>
+              <w:rPr>
+                <w:lang w:val="es-MX"/>
+              </w:rPr>
+              <w:t xml:space="preserve">Se necesita salir </w:t>
+            </w:r>
+            <w:r>
+              <w:rPr>
+                <w:lang w:val="es-MX"/>
+              </w:rPr>
+              <w:t xml:space="preserve">hasta la raíz así para poder entrar a </w:t>
+            </w:r>
+            <w:proofErr w:type="spellStart"/>
+            <w:r>
+              <w:rPr>
+                <w:lang w:val="es-MX"/>
+              </w:rPr>
+              <w:t>img</w:t>
+            </w:r>
+            <w:proofErr w:type="spellEnd"/>
+            <w:r>
+              <w:rPr>
+                <w:lang w:val="es-MX"/>
+              </w:rPr>
+              <w:t xml:space="preserve"> además de que falta el atributo </w:t>
+            </w:r>
+            <w:proofErr w:type="spellStart"/>
+            <w:r>
+              <w:rPr>
+                <w:lang w:val="es-MX"/>
+              </w:rPr>
+              <w:t>downolad</w:t>
+            </w:r>
+            <w:proofErr w:type="spellEnd"/>
+          </w:p>
+        </w:tc>
+      </w:tr>
+      <w:tr>
+        <w:trPr>
+          <w:jc w:val="center"/>
+        </w:trPr>
+        <w:tc>
+          <w:tcPr>
+            <w:tcW w:w="2045" w:type="dxa"/>
+          </w:tcPr>
+          <w:p>
+            <w:pPr>
+              <w:rPr>
+                <w:lang w:val="es-MX"/>
+              </w:rPr>
+            </w:pPr>
+            <w:r>
+              <w:rPr>
+                <w:lang w:val="es-MX"/>
+              </w:rPr>
+              <w:t>evento.html</w:t>
+            </w:r>
+          </w:p>
+        </w:tc>
+        <w:tc>
+          <w:tcPr>
+            <w:tcW w:w="2045" w:type="dxa"/>
+          </w:tcPr>
+          <w:p>
+            <w:pPr>
+              <w:rPr>
+                <w:lang w:val="es-MX"/>
+              </w:rPr>
+            </w:pPr>
+            <w:r>
+              <w:rPr>
+                <w:lang w:val="es-MX"/>
+              </w:rPr>
+              <w:t>../www.uaz.edu.m</w:t>
+            </w:r>
+          </w:p>
+        </w:tc>
+        <w:tc>
+          <w:tcPr>
+            <w:tcW w:w="2045" w:type="dxa"/>
+          </w:tcPr>
+          <w:p>
+            <w:pPr>
+              <w:rPr>
+                <w:lang w:val="es-MX"/>
+              </w:rPr>
+            </w:pPr>
+            <w:r>
+              <w:rPr>
+                <w:lang w:val="es-MX"/>
+              </w:rPr>
+              <w:t>https://www.uaz.edu.mx</w:t>
+            </w:r>
+          </w:p>
+        </w:tc>
+        <w:tc>
+          <w:tcPr>
+            <w:tcW w:w="2045" w:type="dxa"/>
+          </w:tcPr>
+          <w:p>
+            <w:pPr>
+              <w:rPr>
+                <w:lang w:val="es-MX"/>
+              </w:rPr>
+            </w:pPr>
+            <w:r>
+              <w:rPr>
+                <w:lang w:val="es-MX"/>
+              </w:rPr>
+              <w:t xml:space="preserve">Absoluta </w:t>
+            </w:r>
+          </w:p>
+        </w:tc>
+        <w:tc>
+          <w:tcPr>
+            <w:tcW w:w="2045" w:type="dxa"/>
+          </w:tcPr>
+          <w:p>
+            <w:pPr>
+              <w:rPr>
+                <w:lang w:val="es-MX"/>
+              </w:rPr>
+            </w:pPr>
+            <w:hyperlink r:id="rId8" w:history="1">
+              <w:r>
+                <w:rPr>
+                  <w:rStyle w:val="Hipervnculo"/>
+                  <w:lang w:val="es-MX"/>
+                </w:rPr>
+                <w:t>www.uaz.edu.mx</w:t>
+              </w:r>
+            </w:hyperlink>
+            <w:r>
+              <w:rPr>
+                <w:lang w:val="es-MX"/>
+              </w:rPr>
+              <w:t xml:space="preserve"> hac</w:t>
+            </w:r>
+            <w:r>
+              <w:rPr>
+                <w:lang w:val="es-MX"/>
+              </w:rPr>
+              <w:t xml:space="preserve">e referencia a un enlace externo por lo cual le faltan los atributos target y </w:t>
+            </w:r>
+            <w:proofErr w:type="spellStart"/>
+            <w:r>
+              <w:rPr>
+                <w:lang w:val="es-MX"/>
+              </w:rPr>
               <w:t>rel</w:t>
             </w:r>
             <w:proofErr w:type="spellEnd"/>
+            <w:r>
+              <w:rPr>
+                <w:lang w:val="es-MX"/>
+              </w:rPr>
+              <w:t xml:space="preserve"> </w:t>
+            </w:r>
+          </w:p>
+        </w:tc>
+      </w:tr>
+      <w:tr>
+        <w:trPr>
+          <w:jc w:val="center"/>
+        </w:trPr>
+        <w:tc>
+          <w:tcPr>
+            <w:tcW w:w="2045" w:type="dxa"/>
+          </w:tcPr>
+          <w:p>
+            <w:pPr>
+              <w:rPr>
+                <w:lang w:val="es-MX"/>
+              </w:rPr>
+            </w:pPr>
+            <w:r>
+              <w:rPr>
+                <w:lang w:val="es-MX"/>
+              </w:rPr>
+              <w:t>e</w:t>
+            </w:r>
+            <w:r>
+              <w:rPr>
+                <w:lang w:val="es-MX"/>
+              </w:rPr>
+              <w:t>vento.html</w:t>
+            </w:r>
+          </w:p>
+        </w:tc>
+        <w:tc>
+          <w:tcPr>
+            <w:tcW w:w="2045" w:type="dxa"/>
+          </w:tcPr>
+          <w:p>
+            <w:pPr>
+              <w:rPr>
+                <w:lang w:val="es-MX"/>
+              </w:rPr>
+            </w:pPr>
+            <w:proofErr w:type="spellStart"/>
+            <w:r>
+              <w:rPr>
+                <w:lang w:val="es-MX"/>
+              </w:rPr>
+              <w:t>img</w:t>
+            </w:r>
+            <w:proofErr w:type="spellEnd"/>
+            <w:r>
+              <w:rPr>
+                <w:lang w:val="es-MX"/>
+              </w:rPr>
+              <w:t>/logo.png</w:t>
+            </w:r>
+          </w:p>
+        </w:tc>
+        <w:tc>
+          <w:tcPr>
+            <w:tcW w:w="2045" w:type="dxa"/>
+          </w:tcPr>
+          <w:p>
+            <w:pPr>
+              <w:rPr>
+                <w:lang w:val="es-MX"/>
+              </w:rPr>
+            </w:pPr>
+            <w:r>
+              <w:rPr>
+                <w:lang w:val="es-MX"/>
+              </w:rPr>
+              <w:t>../../</w:t>
+            </w:r>
+            <w:proofErr w:type="spellStart"/>
+            <w:r>
+              <w:rPr>
+                <w:lang w:val="es-MX"/>
+              </w:rPr>
+              <w:t>img</w:t>
+            </w:r>
+            <w:proofErr w:type="spellEnd"/>
+            <w:r>
+              <w:rPr>
+                <w:lang w:val="es-MX"/>
+              </w:rPr>
+              <w:t>/logo.png</w:t>
+            </w:r>
+          </w:p>
+        </w:tc>
+        <w:tc>
+          <w:tcPr>
+            <w:tcW w:w="2045" w:type="dxa"/>
+          </w:tcPr>
+          <w:p>
+            <w:pPr>
+              <w:rPr>
+                <w:lang w:val="es-MX"/>
+              </w:rPr>
+            </w:pPr>
+            <w:r>
+              <w:rPr>
+                <w:lang w:val="es-MX"/>
+              </w:rPr>
+              <w:t>Relativa</w:t>
+            </w:r>
+          </w:p>
+        </w:tc>
+        <w:tc>
+          <w:tcPr>
+            <w:tcW w:w="2045" w:type="dxa"/>
+          </w:tcPr>
+          <w:p>
+            <w:pPr>
+              <w:rPr>
+                <w:lang w:val="es-MX"/>
+              </w:rPr>
+            </w:pPr>
+            <w:r>
+              <w:rPr>
+                <w:lang w:val="es-MX"/>
+              </w:rPr>
+              <w:t xml:space="preserve">Se debe salir hasta la raíz para entrar a la carpeta </w:t>
+            </w:r>
+            <w:proofErr w:type="spellStart"/>
+            <w:r>
+              <w:rPr>
+                <w:lang w:val="es-MX"/>
+              </w:rPr>
+              <w:t>img</w:t>
+            </w:r>
+            <w:proofErr w:type="spellEnd"/>
+            <w:r>
+              <w:rPr>
+                <w:lang w:val="es-MX"/>
+              </w:rPr>
+              <w:t xml:space="preserve"> correcta</w:t>
+            </w:r>
           </w:p>
         </w:tc>
       </w:tr>
@@ -4258,6 +5916,34 @@
     </w:p>
     <w:p>
       <w:pPr>
+        <w:rPr>
+          <w:lang w:val="es-MX"/>
+        </w:rPr>
+      </w:pPr>
+    </w:p>
+    <w:p>
+      <w:pPr>
+        <w:rPr>
+          <w:lang w:val="es-MX"/>
+        </w:rPr>
+      </w:pPr>
+    </w:p>
+    <w:p>
+      <w:pPr>
+        <w:rPr>
+          <w:lang w:val="es-MX"/>
+        </w:rPr>
+      </w:pPr>
+    </w:p>
+    <w:p>
+      <w:pPr>
+        <w:rPr>
+          <w:lang w:val="es-MX"/>
+        </w:rPr>
+      </w:pPr>
+    </w:p>
+    <w:p>
+      <w:pPr>
         <w:pStyle w:val="Ttulo1"/>
         <w:rPr>
           <w:lang w:val="es-MX"/>
@@ -4429,6 +6115,159 @@
     <w:p>
       <w:pPr>
         <w:pStyle w:val="Listaconnmeros"/>
+        <w:numPr>
+          <w:ilvl w:val="0"/>
+          <w:numId w:val="0"/>
+        </w:numPr>
+        <w:ind w:left="360"/>
+        <w:rPr>
+          <w:lang w:val="es-MX"/>
+        </w:rPr>
+      </w:pPr>
+    </w:p>
+    <w:p>
+      <w:pPr>
+        <w:pStyle w:val="Listaconnmeros"/>
+        <w:numPr>
+          <w:ilvl w:val="0"/>
+          <w:numId w:val="10"/>
+        </w:numPr>
+        <w:rPr>
+          <w:lang w:val="es-MX"/>
+        </w:rPr>
+      </w:pPr>
+      <w:r>
+        <w:rPr>
+          <w:b/>
+          <w:bCs/>
+          <w:lang w:val="es-MX"/>
+        </w:rPr>
+        <w:t>URL absoluta:</w:t>
+      </w:r>
+      <w:r>
+        <w:rPr>
+          <w:lang w:val="es-MX"/>
+        </w:rPr>
+        <w:t xml:space="preserve"> incluye la dirección completa, ejemplo:</w:t>
+      </w:r>
+    </w:p>
+    <w:p>
+      <w:pPr>
+        <w:pStyle w:val="Listaconnmeros"/>
+        <w:numPr>
+          <w:ilvl w:val="0"/>
+          <w:numId w:val="0"/>
+        </w:numPr>
+        <w:ind w:left="1080"/>
+        <w:rPr>
+          <w:lang w:val="es-MX"/>
+        </w:rPr>
+      </w:pPr>
+      <w:hyperlink r:id="rId9" w:history="1">
+        <w:r>
+          <w:rPr>
+            <w:rStyle w:val="Hipervnculo"/>
+            <w:lang w:val="es-MX"/>
+          </w:rPr>
+          <w:t>https://sitio.com/img/logo.png</w:t>
+        </w:r>
+      </w:hyperlink>
+    </w:p>
+    <w:p>
+      <w:pPr>
+        <w:pStyle w:val="Listaconnmeros"/>
+        <w:numPr>
+          <w:ilvl w:val="0"/>
+          <w:numId w:val="10"/>
+        </w:numPr>
+        <w:rPr>
+          <w:lang w:val="es-MX"/>
+        </w:rPr>
+      </w:pPr>
+      <w:r>
+        <w:rPr>
+          <w:b/>
+          <w:bCs/>
+          <w:lang w:val="es-MX"/>
+        </w:rPr>
+        <w:t>Ruta relativa:</w:t>
+      </w:r>
+      <w:r>
+        <w:rPr>
+          <w:b/>
+          <w:bCs/>
+          <w:lang w:val="es-MX"/>
+        </w:rPr>
+        <w:t xml:space="preserve"> </w:t>
+      </w:r>
+      <w:r>
+        <w:rPr>
+          <w:lang w:val="es-MX"/>
+        </w:rPr>
+        <w:t>Depende de la ubicación del archivo actual, ejemplo:</w:t>
+      </w:r>
+    </w:p>
+    <w:p>
+      <w:pPr>
+        <w:pStyle w:val="Listaconnmeros"/>
+        <w:numPr>
+          <w:ilvl w:val="0"/>
+          <w:numId w:val="0"/>
+        </w:numPr>
+        <w:ind w:left="1080"/>
+        <w:rPr>
+          <w:lang w:val="es-MX"/>
+        </w:rPr>
+      </w:pPr>
+      <w:proofErr w:type="spellStart"/>
+      <w:r>
+        <w:rPr>
+          <w:lang w:val="es-MX"/>
+        </w:rPr>
+        <w:t>i</w:t>
+      </w:r>
+      <w:r>
+        <w:rPr>
+          <w:lang w:val="es-MX"/>
+        </w:rPr>
+        <w:t>m</w:t>
+      </w:r>
+      <w:r>
+        <w:rPr>
+          <w:lang w:val="es-MX"/>
+        </w:rPr>
+        <w:t>g</w:t>
+      </w:r>
+      <w:proofErr w:type="spellEnd"/>
+      <w:r>
+        <w:rPr>
+          <w:lang w:val="es-MX"/>
+        </w:rPr>
+        <w:t>/logo.png</w:t>
+      </w:r>
+    </w:p>
+    <w:p>
+      <w:pPr>
+        <w:pStyle w:val="Listaconnmeros"/>
+        <w:numPr>
+          <w:ilvl w:val="0"/>
+          <w:numId w:val="0"/>
+        </w:numPr>
+        <w:ind w:left="360"/>
+        <w:rPr>
+          <w:lang w:val="es-MX"/>
+        </w:rPr>
+      </w:pPr>
+      <w:r>
+        <w:rPr>
+          <w:lang w:val="es-MX"/>
+        </w:rPr>
+        <w:t xml:space="preserve"> </w:t>
+      </w:r>
+    </w:p>
+    <w:p>
+      <w:pPr>
+        <w:pStyle w:val="Listaconnmeros"/>
         <w:rPr>
           <w:lang w:val="es-MX"/>
         </w:rPr>
@@ -4458,15 +6297,119 @@
         <w:rPr>
           <w:lang w:val="es-MX"/>
         </w:rPr>
-        <w:t xml:space="preserve"> ../..</w:t>
+        <w:t xml:space="preserve"> ..</w:t>
       </w:r>
       <w:proofErr w:type="gramEnd"/>
       <w:r>
         <w:rPr>
           <w:lang w:val="es-MX"/>
         </w:rPr>
-        <w:t>/?</w:t>
+        <w:t>/../?</w:t>
       </w:r>
+    </w:p>
+    <w:p>
+      <w:pPr>
+        <w:pStyle w:val="Listaconnmeros"/>
+        <w:numPr>
+          <w:ilvl w:val="0"/>
+          <w:numId w:val="0"/>
+        </w:numPr>
+        <w:ind w:left="360"/>
+        <w:rPr>
+          <w:lang w:val="es-MX"/>
+        </w:rPr>
+      </w:pPr>
+    </w:p>
+    <w:p>
+      <w:pPr>
+        <w:pStyle w:val="Listaconnmeros"/>
+        <w:numPr>
+          <w:ilvl w:val="0"/>
+          <w:numId w:val="9"/>
+        </w:numPr>
+        <w:rPr>
+          <w:lang w:val="es-MX"/>
+        </w:rPr>
+      </w:pPr>
+      <w:proofErr w:type="gramStart"/>
+      <w:r>
+        <w:rPr>
+          <w:b/>
+          <w:bCs/>
+          <w:lang w:val="es-MX"/>
+        </w:rPr>
+        <w:t>..</w:t>
+      </w:r>
+      <w:proofErr w:type="gramEnd"/>
+      <w:r>
+        <w:rPr>
+          <w:b/>
+          <w:bCs/>
+          <w:lang w:val="es-MX"/>
+        </w:rPr>
+        <w:t>/</w:t>
+      </w:r>
+      <w:r>
+        <w:rPr>
+          <w:lang w:val="es-MX"/>
+        </w:rPr>
+        <w:t xml:space="preserve"> sirve para salir de la carpeta actual y subir un nivel</w:t>
+      </w:r>
+    </w:p>
+    <w:p>
+      <w:pPr>
+        <w:pStyle w:val="Listaconnmeros"/>
+        <w:numPr>
+          <w:ilvl w:val="0"/>
+          <w:numId w:val="9"/>
+        </w:numPr>
+        <w:rPr>
+          <w:lang w:val="es-MX"/>
+        </w:rPr>
+      </w:pPr>
+      <w:proofErr w:type="gramStart"/>
+      <w:r>
+        <w:rPr>
+          <w:b/>
+          <w:bCs/>
+          <w:lang w:val="es-MX"/>
+        </w:rPr>
+        <w:t>../..</w:t>
+      </w:r>
+      <w:proofErr w:type="gramEnd"/>
+      <w:r>
+        <w:rPr>
+          <w:b/>
+          <w:bCs/>
+          <w:lang w:val="es-MX"/>
+        </w:rPr>
+        <w:t>/</w:t>
+      </w:r>
+      <w:r>
+        <w:rPr>
+          <w:lang w:val="es-MX"/>
+        </w:rPr>
+        <w:t xml:space="preserve"> p</w:t>
+      </w:r>
+      <w:r>
+        <w:rPr>
+          <w:lang w:val="es-MX"/>
+        </w:rPr>
+        <w:t>ermite subir dos niveles en la estructura de carpetas</w:t>
+      </w:r>
+    </w:p>
+    <w:p>
+      <w:pPr>
+        <w:pStyle w:val="Listaconnmeros"/>
+        <w:numPr>
+          <w:ilvl w:val="0"/>
+          <w:numId w:val="0"/>
+        </w:numPr>
+        <w:ind w:left="360"/>
+        <w:rPr>
+          <w:lang w:val="es-MX"/>
+        </w:rPr>
+      </w:pPr>
     </w:p>
     <w:p>
       <w:pPr>
@@ -4499,6 +6442,65 @@
     <w:p>
       <w:pPr>
         <w:pStyle w:val="Listaconnmeros"/>
+        <w:numPr>
+          <w:ilvl w:val="0"/>
+          <w:numId w:val="0"/>
+        </w:numPr>
+        <w:ind w:left="360"/>
+        <w:rPr>
+          <w:lang w:val="es-MX"/>
+        </w:rPr>
+      </w:pPr>
+    </w:p>
+    <w:p>
+      <w:pPr>
+        <w:pStyle w:val="Listaconnmeros"/>
+        <w:numPr>
+          <w:ilvl w:val="0"/>
+          <w:numId w:val="0"/>
+        </w:numPr>
+        <w:ind w:left="360"/>
+        <w:rPr>
+          <w:lang w:val="es-MX"/>
+        </w:rPr>
+      </w:pPr>
+      <w:r>
+        <w:rPr>
+          <w:lang w:val="es-MX"/>
+        </w:rPr>
+        <w:t xml:space="preserve">Porque </w:t>
+      </w:r>
+      <w:proofErr w:type="spellStart"/>
+      <w:r>
+        <w:rPr>
+          <w:lang w:val="es-MX"/>
+        </w:rPr>
+        <w:t>img</w:t>
+      </w:r>
+      <w:proofErr w:type="spellEnd"/>
+      <w:r>
+        <w:rPr>
+          <w:lang w:val="es-MX"/>
+        </w:rPr>
+        <w:t>/logo.png se busca tomando como referencia la carpeta donde está la página actual. Si la página esta en otra carpeta, la ruta puede quedar incorrecta.</w:t>
+      </w:r>
+    </w:p>
+    <w:p>
+      <w:pPr>
+        <w:pStyle w:val="Listaconnmeros"/>
+        <w:numPr>
+          <w:ilvl w:val="0"/>
+          <w:numId w:val="0"/>
+        </w:numPr>
+        <w:ind w:left="360"/>
+        <w:rPr>
+          <w:lang w:val="es-MX"/>
+        </w:rPr>
+      </w:pPr>
+    </w:p>
+    <w:p>
+      <w:pPr>
+        <w:pStyle w:val="Listaconnmeros"/>
         <w:rPr>
           <w:lang w:val="es-MX"/>
         </w:rPr>
@@ -4541,6 +6543,90 @@
     <w:p>
       <w:pPr>
         <w:pStyle w:val="Listaconnmeros"/>
+        <w:numPr>
+          <w:ilvl w:val="0"/>
+          <w:numId w:val="0"/>
+        </w:numPr>
+        <w:ind w:left="360"/>
+        <w:rPr>
+          <w:lang w:val="es-MX"/>
+        </w:rPr>
+      </w:pPr>
+    </w:p>
+    <w:p>
+      <w:pPr>
+        <w:pStyle w:val="Listaconnmeros"/>
+        <w:numPr>
+          <w:ilvl w:val="0"/>
+          <w:numId w:val="11"/>
+        </w:numPr>
+        <w:rPr>
+          <w:lang w:val="es-MX"/>
+        </w:rPr>
+      </w:pPr>
+      <w:proofErr w:type="spellStart"/>
+      <w:r>
+        <w:rPr>
+          <w:lang w:val="es-MX"/>
+        </w:rPr>
+        <w:t>Img</w:t>
+      </w:r>
+      <w:proofErr w:type="spellEnd"/>
+      <w:r>
+        <w:rPr>
+          <w:lang w:val="es-MX"/>
+        </w:rPr>
+        <w:t>/logo.png busca desde la ubicación actual.</w:t>
+      </w:r>
+    </w:p>
+    <w:p>
+      <w:pPr>
+        <w:pStyle w:val="Listaconnmeros"/>
+        <w:numPr>
+          <w:ilvl w:val="0"/>
+          <w:numId w:val="11"/>
+        </w:numPr>
+        <w:rPr>
+          <w:lang w:val="es-MX"/>
+        </w:rPr>
+      </w:pPr>
+      <w:r>
+        <w:rPr>
+          <w:lang w:val="es-MX"/>
+        </w:rPr>
+        <w:t>/</w:t>
+      </w:r>
+      <w:proofErr w:type="spellStart"/>
+      <w:r>
+        <w:rPr>
+          <w:lang w:val="es-MX"/>
+        </w:rPr>
+        <w:t>img</w:t>
+      </w:r>
+      <w:proofErr w:type="spellEnd"/>
+      <w:r>
+        <w:rPr>
+          <w:lang w:val="es-MX"/>
+        </w:rPr>
+        <w:t>/logo.png busca desde la raíz del sitio web.</w:t>
+      </w:r>
+    </w:p>
+    <w:p>
+      <w:pPr>
+        <w:pStyle w:val="Listaconnmeros"/>
+        <w:numPr>
+          <w:ilvl w:val="0"/>
+          <w:numId w:val="0"/>
+        </w:numPr>
+        <w:ind w:left="360"/>
+        <w:rPr>
+          <w:lang w:val="es-MX"/>
+        </w:rPr>
+      </w:pPr>
+    </w:p>
+    <w:p>
+      <w:pPr>
+        <w:pStyle w:val="Listaconnmeros"/>
         <w:rPr>
           <w:lang w:val="es-MX"/>
         </w:rPr>
@@ -4555,6 +6641,24 @@
     <w:p>
       <w:pPr>
         <w:pStyle w:val="Listaconnmeros"/>
+        <w:numPr>
+          <w:ilvl w:val="0"/>
+          <w:numId w:val="0"/>
+        </w:numPr>
+        <w:ind w:left="360"/>
+        <w:rPr>
+          <w:lang w:val="es-MX"/>
+        </w:rPr>
+      </w:pPr>
+    </w:p>
+    <w:p>
+      <w:pPr>
+        <w:pStyle w:val="Listaconnmeros"/>
+        <w:numPr>
+          <w:ilvl w:val="0"/>
+          <w:numId w:val="0"/>
+        </w:numPr>
+        <w:ind w:left="360"/>
         <w:rPr>
           <w:lang w:val="es-MX"/>
         </w:rPr>
@@ -4563,12 +6667,85 @@
         <w:rPr>
           <w:lang w:val="es-MX"/>
         </w:rPr>
+        <w:t>Conviene usar una URL absoluta cuando el recurso está en otro sitio web o dominio.</w:t>
+      </w:r>
+    </w:p>
+    <w:p>
+      <w:pPr>
+        <w:pStyle w:val="Listaconnmeros"/>
+        <w:numPr>
+          <w:ilvl w:val="0"/>
+          <w:numId w:val="0"/>
+        </w:numPr>
+        <w:ind w:left="360"/>
+        <w:rPr>
+          <w:lang w:val="es-MX"/>
+        </w:rPr>
+      </w:pPr>
+    </w:p>
+    <w:p>
+      <w:pPr>
+        <w:pStyle w:val="Listaconnmeros"/>
+        <w:rPr>
+          <w:lang w:val="es-MX"/>
+        </w:rPr>
+      </w:pPr>
+      <w:r>
+        <w:rPr>
+          <w:lang w:val="es-MX"/>
+        </w:rPr>
+        <w:lastRenderedPageBreak/>
         <w:t>Si una solicitud devuelve 404, ¿significa necesariamente que el servidor está caído? Explique.</w:t>
       </w:r>
     </w:p>
     <w:p>
       <w:pPr>
         <w:pStyle w:val="Listaconnmeros"/>
+        <w:numPr>
+          <w:ilvl w:val="0"/>
+          <w:numId w:val="0"/>
+        </w:numPr>
+        <w:ind w:left="360" w:hanging="360"/>
+        <w:rPr>
+          <w:lang w:val="es-MX"/>
+        </w:rPr>
+      </w:pPr>
+    </w:p>
+    <w:p>
+      <w:pPr>
+        <w:pStyle w:val="Listaconnmeros"/>
+        <w:numPr>
+          <w:ilvl w:val="0"/>
+          <w:numId w:val="0"/>
+        </w:numPr>
+        <w:ind w:left="360" w:hanging="360"/>
+        <w:rPr>
+          <w:lang w:val="es-MX"/>
+        </w:rPr>
+      </w:pPr>
+      <w:r>
+        <w:rPr>
+          <w:lang w:val="es-MX"/>
+        </w:rPr>
+        <w:t>No. Un error 404 significa que el servidor respondió, pero no encontró el recurso solicitado. El servidor puede estar funcionando correctamente.</w:t>
+      </w:r>
+    </w:p>
+    <w:p>
+      <w:pPr>
+        <w:pStyle w:val="Listaconnmeros"/>
+        <w:numPr>
+          <w:ilvl w:val="0"/>
+          <w:numId w:val="0"/>
+        </w:numPr>
+        <w:ind w:left="360" w:hanging="360"/>
+        <w:rPr>
+          <w:lang w:val="es-MX"/>
+        </w:rPr>
+      </w:pPr>
+    </w:p>
+    <w:p>
+      <w:pPr>
+        <w:pStyle w:val="Listaconnmeros"/>
         <w:rPr>
           <w:lang w:val="es-MX"/>
         </w:rPr>
@@ -4582,6 +6759,38 @@
     </w:p>
     <w:p>
       <w:pPr>
+        <w:pStyle w:val="Listaconnmeros"/>
+        <w:numPr>
+          <w:ilvl w:val="0"/>
+          <w:numId w:val="0"/>
+        </w:numPr>
+        <w:ind w:left="360"/>
+        <w:rPr>
+          <w:lang w:val="es-MX"/>
+        </w:rPr>
+      </w:pPr>
+    </w:p>
+    <w:p>
+      <w:pPr>
+        <w:pStyle w:val="Listaconnmeros"/>
+        <w:numPr>
+          <w:ilvl w:val="0"/>
+          <w:numId w:val="0"/>
+        </w:numPr>
+        <w:ind w:left="360"/>
+        <w:rPr>
+          <w:lang w:val="es-MX"/>
+        </w:rPr>
+      </w:pPr>
+      <w:r>
+        <w:rPr>
+          <w:lang w:val="es-MX"/>
+        </w:rPr>
+        <w:t>Las rutas relativas permiten mover o publicar el proyecto más fácilmente sin tener que cambiar todas las direcciones de los archivos.</w:t>
+      </w:r>
+    </w:p>
+    <w:p>
+      <w:pPr>
         <w:pStyle w:val="Ttulo1"/>
         <w:rPr>
           <w:lang w:val="es-MX"/>
@@ -4634,7 +6843,6 @@
         <w:rPr>
           <w:lang w:val="es-MX"/>
         </w:rPr>
-        <w:lastRenderedPageBreak/>
         <w:t xml:space="preserve">Captura de </w:t>
       </w:r>
       <w:proofErr w:type="spellStart"/>
@@ -5087,6 +7295,137 @@
 <file path=word/numbering.xml><?xml version="1.0" encoding="utf-8"?>
 <w:numbering xmlns:wpc="http://schemas.microsoft.com/office/word/2010/wordprocessingCanvas" xmlns:cx="http://schemas.microsoft.com/office/drawing/2014/chartex" xmlns:cx1="http://schemas.microsoft.com/office/drawing/2015/9/8/chartex" xmlns:cx2="http://schemas.microsoft.com/office/drawing/2015/10/21/chartex" xmlns:cx3="http://schemas.microsoft.com/office/drawing/2016/5/9/chartex" xmlns:cx4="http://schemas.microsoft.com/office/drawing/2016/5/10/chartex" xmlns:cx5="http://schemas.microsoft.com/office/drawing/2016/5/11/chartex" xmlns:cx6="http://schemas.microsoft.com/office/drawing/2016/5/12/chartex" xmlns:cx7="http://schemas.microsoft.com/office/drawing/2016/5/13/chartex" xmlns:cx8="http://schemas.microsoft.com/office/drawing/2016/5/14/chartex" xmlns:mc="http://schemas.openxmlformats.org/markup-compatibility/2006" xmlns:aink="http://schemas.microsoft.com/office/drawing/2016/ink" xmlns:am3d="http://schemas.microsoft.com/office/drawing/2017/model3d" xmlns:o="urn:schemas-microsoft-com:office:office" xmlns:oel="http://schemas.microsoft.com/office/2019/extlst" xmlns:r="http://schemas.openxmlformats.org/officeDocument/2006/relationships" xmlns:m="http://schemas.openxmlformats.org/officeDocument/2006/math" xmlns:v="urn:schemas-microsoft-com:vml" xmlns:wp14="http://schemas.microsoft.com/office/word/2010/wordprocessingDrawing" xmlns:wp="http://schemas.openxmlformats.org/drawingml/2006/wordprocessingDrawing" xmlns:w10="urn:schemas-microsoft-com:office:word" xmlns:w="http://schemas.openxmlformats.org/wordprocessingml/2006/main" xmlns:w14="http://schemas.microsoft.com/office/word/2010/wordml" xmlns:w15="http://schemas.microsoft.com/office/word/2012/wordml" xmlns:w16cex="http://schemas.microsoft.com/office/word/2018/wordml/cex" xmlns:w16cid="http://schemas.microsoft.com/office/word/2016/wordml/cid" xmlns:w16="http://schemas.microsoft.com/office/word/2018/wordml" xmlns:w16du="http://schemas.microsoft.com/office/word/2023/wordml/word16du" xmlns:w16sdtdh="http://schemas.microsoft.com/office/word/2020/wordml/sdtdatahash" xmlns:w16sdtfl="http://schemas.microsoft.com/office/word/2024/wordml/sdtformatlock" xmlns:w16se="http://schemas.microsoft.com/office/word/2015/wordml/symex" xmlns:wpg="http://schemas.microsoft.com/office/word/2010/wordprocessingGroup" xmlns:wpi="http://schemas.microsoft.com/office/word/2010/wordprocessingInk" xmlns:wne="http://schemas.microsoft.com/office/word/2006/wordml" xmlns:wps="http://schemas.microsoft.com/office/word/2010/wordprocessingShape" mc:Ignorable="w14 w15 w16se w16cid w16 w16cex w16sdtdh w16sdtfl w16du wp14">
   <w:abstractNum w:abstractNumId="0" w15:restartNumberingAfterBreak="0">
+    <w:nsid w:val="FFFFFF88"/>
+    <w:multiLevelType w:val="singleLevel"/>
+    <w:tmpl w:val="13A4EABE"/>
+    <w:lvl w:ilvl="0">
+      <w:start w:val="1"/>
+      <w:numFmt w:val="decimal"/>
+      <w:pStyle w:val="Listaconnmeros"/>
+      <w:lvlText w:val="%1."/>
+      <w:lvlJc w:val="left"/>
+      <w:pPr>
+        <w:tabs>
+          <w:tab w:val="num" w:pos="360"/>
+        </w:tabs>
+        <w:ind w:left="360" w:hanging="360"/>
+      </w:pPr>
+    </w:lvl>
+  </w:abstractNum>
+  <w:abstractNum w:abstractNumId="1" w15:restartNumberingAfterBreak="0">
+    <w:nsid w:val="03AF0FF6"/>
+    <w:multiLevelType w:val="hybridMultilevel"/>
+    <w:tmpl w:val="F8A6AC80"/>
+    <w:lvl w:ilvl="0" w:tplc="080A0001">
+      <w:start w:val="1"/>
+      <w:numFmt w:val="bullet"/>
+      <w:lvlText w:val=""/>
+      <w:lvlJc w:val="left"/>
+      <w:pPr>
+        <w:ind w:left="1080" w:hanging="360"/>
+      </w:pPr>
+      <w:rPr>
+        <w:rFonts w:ascii="Symbol" w:hAnsi="Symbol" w:hint="default"/>
+      </w:rPr>
+    </w:lvl>
+    <w:lvl w:ilvl="1" w:tplc="080A0003" w:tentative="1">
+      <w:start w:val="1"/>
+      <w:numFmt w:val="bullet"/>
+      <w:lvlText w:val="o"/>
+      <w:lvlJc w:val="left"/>
+      <w:pPr>
+        <w:ind w:left="1800" w:hanging="360"/>
+      </w:pPr>
+      <w:rPr>
+        <w:rFonts w:ascii="Courier New" w:hAnsi="Courier New" w:cs="Courier New" w:hint="default"/>
+      </w:rPr>
+    </w:lvl>
+    <w:lvl w:ilvl="2" w:tplc="080A0005" w:tentative="1">
+      <w:start w:val="1"/>
+      <w:numFmt w:val="bullet"/>
+      <w:lvlText w:val=""/>
+      <w:lvlJc w:val="left"/>
+      <w:pPr>
+        <w:ind w:left="2520" w:hanging="360"/>
+      </w:pPr>
+      <w:rPr>
+        <w:rFonts w:ascii="Wingdings" w:hAnsi="Wingdings" w:hint="default"/>
+      </w:rPr>
+    </w:lvl>
+    <w:lvl w:ilvl="3" w:tplc="080A0001" w:tentative="1">
+      <w:start w:val="1"/>
+      <w:numFmt w:val="bullet"/>
+      <w:lvlText w:val=""/>
+      <w:lvlJc w:val="left"/>
+      <w:pPr>
+        <w:ind w:left="3240" w:hanging="360"/>
+      </w:pPr>
+      <w:rPr>
+        <w:rFonts w:ascii="Symbol" w:hAnsi="Symbol" w:hint="default"/>
+      </w:rPr>
+    </w:lvl>
+    <w:lvl w:ilvl="4" w:tplc="080A0003" w:tentative="1">
+      <w:start w:val="1"/>
+      <w:numFmt w:val="bullet"/>
+      <w:lvlText w:val="o"/>
+      <w:lvlJc w:val="left"/>
+      <w:pPr>
+        <w:ind w:left="3960" w:hanging="360"/>
+      </w:pPr>
+      <w:rPr>
+        <w:rFonts w:ascii="Courier New" w:hAnsi="Courier New" w:cs="Courier New" w:hint="default"/>
+      </w:rPr>
+    </w:lvl>
+    <w:lvl w:ilvl="5" w:tplc="080A0005" w:tentative="1">
+      <w:start w:val="1"/>
+      <w:numFmt w:val="bullet"/>
+      <w:lvlText w:val=""/>
+      <w:lvlJc w:val="left"/>
+      <w:pPr>
+        <w:ind w:left="4680" w:hanging="360"/>
+      </w:pPr>
+      <w:rPr>
+        <w:rFonts w:ascii="Wingdings" w:hAnsi="Wingdings" w:hint="default"/>
+      </w:rPr>
+    </w:lvl>
+    <w:lvl w:ilvl="6" w:tplc="080A0001" w:tentative="1">
+      <w:start w:val="1"/>
+      <w:numFmt w:val="bullet"/>
+      <w:lvlText w:val=""/>
+      <w:lvlJc w:val="left"/>
+      <w:pPr>
+        <w:ind w:left="5400" w:hanging="360"/>
+      </w:pPr>
+      <w:rPr>
+        <w:rFonts w:ascii="Symbol" w:hAnsi="Symbol" w:hint="default"/>
+      </w:rPr>
+    </w:lvl>
+    <w:lvl w:ilvl="7" w:tplc="080A0003" w:tentative="1">
+      <w:start w:val="1"/>
+      <w:numFmt w:val="bullet"/>
+      <w:lvlText w:val="o"/>
+      <w:lvlJc w:val="left"/>
+      <w:pPr>
+        <w:ind w:left="6120" w:hanging="360"/>
+      </w:pPr>
+      <w:rPr>
+        <w:rFonts w:ascii="Courier New" w:hAnsi="Courier New" w:cs="Courier New" w:hint="default"/>
+      </w:rPr>
+    </w:lvl>
+    <w:lvl w:ilvl="8" w:tplc="080A0005" w:tentative="1">
+      <w:start w:val="1"/>
+      <w:numFmt w:val="bullet"/>
+      <w:lvlText w:val=""/>
+      <w:lvlJc w:val="left"/>
+      <w:pPr>
+        <w:ind w:left="6840" w:hanging="360"/>
+      </w:pPr>
+      <w:rPr>
+        <w:rFonts w:ascii="Wingdings" w:hAnsi="Wingdings" w:hint="default"/>
+      </w:rPr>
+    </w:lvl>
+  </w:abstractNum>
+  <w:abstractNum w:abstractNumId="2" w15:restartNumberingAfterBreak="0">
     <w:nsid w:val="08247D51"/>
     <w:multiLevelType w:val="multilevel"/>
     <w:tmpl w:val="DEE6CC90"/>
@@ -5203,7 +7542,7 @@
       </w:pPr>
     </w:lvl>
   </w:abstractNum>
-  <w:abstractNum w:abstractNumId="1" w15:restartNumberingAfterBreak="0">
+  <w:abstractNum w:abstractNumId="3" w15:restartNumberingAfterBreak="0">
     <w:nsid w:val="147574CF"/>
     <w:multiLevelType w:val="multilevel"/>
     <w:tmpl w:val="19ECBF08"/>
@@ -5325,7 +7664,7 @@
       </w:pPr>
     </w:lvl>
   </w:abstractNum>
-  <w:abstractNum w:abstractNumId="2" w15:restartNumberingAfterBreak="0">
+  <w:abstractNum w:abstractNumId="4" w15:restartNumberingAfterBreak="0">
     <w:nsid w:val="1ACE08C5"/>
     <w:multiLevelType w:val="multilevel"/>
     <w:tmpl w:val="27F2F8D2"/>
@@ -5439,7 +7778,7 @@
       </w:pPr>
     </w:lvl>
   </w:abstractNum>
-  <w:abstractNum w:abstractNumId="3" w15:restartNumberingAfterBreak="0">
+  <w:abstractNum w:abstractNumId="5" w15:restartNumberingAfterBreak="0">
     <w:nsid w:val="47793228"/>
     <w:multiLevelType w:val="multilevel"/>
     <w:tmpl w:val="E2A45230"/>
@@ -5556,7 +7895,120 @@
       </w:pPr>
     </w:lvl>
   </w:abstractNum>
-  <w:abstractNum w:abstractNumId="4" w15:restartNumberingAfterBreak="0">
+  <w:abstractNum w:abstractNumId="6" w15:restartNumberingAfterBreak="0">
+    <w:nsid w:val="52913ED5"/>
+    <w:multiLevelType w:val="hybridMultilevel"/>
+    <w:tmpl w:val="70643272"/>
+    <w:lvl w:ilvl="0" w:tplc="080A0001">
+      <w:start w:val="1"/>
+      <w:numFmt w:val="bullet"/>
+      <w:lvlText w:val=""/>
+      <w:lvlJc w:val="left"/>
+      <w:pPr>
+        <w:ind w:left="1080" w:hanging="360"/>
+      </w:pPr>
+      <w:rPr>
+        <w:rFonts w:ascii="Symbol" w:hAnsi="Symbol" w:hint="default"/>
+      </w:rPr>
+    </w:lvl>
+    <w:lvl w:ilvl="1" w:tplc="080A0003" w:tentative="1">
+      <w:start w:val="1"/>
+      <w:numFmt w:val="bullet"/>
+      <w:lvlText w:val="o"/>
+      <w:lvlJc w:val="left"/>
+      <w:pPr>
+        <w:ind w:left="1800" w:hanging="360"/>
+      </w:pPr>
+      <w:rPr>
+        <w:rFonts w:ascii="Courier New" w:hAnsi="Courier New" w:cs="Courier New" w:hint="default"/>
+      </w:rPr>
+    </w:lvl>
+    <w:lvl w:ilvl="2" w:tplc="080A0005" w:tentative="1">
+      <w:start w:val="1"/>
+      <w:numFmt w:val="bullet"/>
+      <w:lvlText w:val=""/>
+      <w:lvlJc w:val="left"/>
+      <w:pPr>
+        <w:ind w:left="2520" w:hanging="360"/>
+      </w:pPr>
+      <w:rPr>
+        <w:rFonts w:ascii="Wingdings" w:hAnsi="Wingdings" w:hint="default"/>
+      </w:rPr>
+    </w:lvl>
+    <w:lvl w:ilvl="3" w:tplc="080A0001" w:tentative="1">
+      <w:start w:val="1"/>
+      <w:numFmt w:val="bullet"/>
+      <w:lvlText w:val=""/>
+      <w:lvlJc w:val="left"/>
+      <w:pPr>
+        <w:ind w:left="3240" w:hanging="360"/>
+      </w:pPr>
+      <w:rPr>
+        <w:rFonts w:ascii="Symbol" w:hAnsi="Symbol" w:hint="default"/>
+      </w:rPr>
+    </w:lvl>
+    <w:lvl w:ilvl="4" w:tplc="080A0003" w:tentative="1">
+      <w:start w:val="1"/>
+      <w:numFmt w:val="bullet"/>
+      <w:lvlText w:val="o"/>
+      <w:lvlJc w:val="left"/>
+      <w:pPr>
+        <w:ind w:left="3960" w:hanging="360"/>
+      </w:pPr>
+      <w:rPr>
+        <w:rFonts w:ascii="Courier New" w:hAnsi="Courier New" w:cs="Courier New" w:hint="default"/>
+      </w:rPr>
+    </w:lvl>
+    <w:lvl w:ilvl="5" w:tplc="080A0005" w:tentative="1">
+      <w:start w:val="1"/>
+      <w:numFmt w:val="bullet"/>
+      <w:lvlText w:val=""/>
+      <w:lvlJc w:val="left"/>
+      <w:pPr>
+        <w:ind w:left="4680" w:hanging="360"/>
+      </w:pPr>
+      <w:rPr>
+        <w:rFonts w:ascii="Wingdings" w:hAnsi="Wingdings" w:hint="default"/>
+      </w:rPr>
+    </w:lvl>
+    <w:lvl w:ilvl="6" w:tplc="080A0001" w:tentative="1">
+      <w:start w:val="1"/>
+      <w:numFmt w:val="bullet"/>
+      <w:lvlText w:val=""/>
+      <w:lvlJc w:val="left"/>
+      <w:pPr>
+        <w:ind w:left="5400" w:hanging="360"/>
+      </w:pPr>
+      <w:rPr>
+        <w:rFonts w:ascii="Symbol" w:hAnsi="Symbol" w:hint="default"/>
+      </w:rPr>
+    </w:lvl>
+    <w:lvl w:ilvl="7" w:tplc="080A0003" w:tentative="1">
+      <w:start w:val="1"/>
+      <w:numFmt w:val="bullet"/>
+      <w:lvlText w:val="o"/>
+      <w:lvlJc w:val="left"/>
+      <w:pPr>
+        <w:ind w:left="6120" w:hanging="360"/>
+      </w:pPr>
+      <w:rPr>
+        <w:rFonts w:ascii="Courier New" w:hAnsi="Courier New" w:cs="Courier New" w:hint="default"/>
+      </w:rPr>
+    </w:lvl>
+    <w:lvl w:ilvl="8" w:tplc="080A0005" w:tentative="1">
+      <w:start w:val="1"/>
+      <w:numFmt w:val="bullet"/>
+      <w:lvlText w:val=""/>
+      <w:lvlJc w:val="left"/>
+      <w:pPr>
+        <w:ind w:left="6840" w:hanging="360"/>
+      </w:pPr>
+      <w:rPr>
+        <w:rFonts w:ascii="Wingdings" w:hAnsi="Wingdings" w:hint="default"/>
+      </w:rPr>
+    </w:lvl>
+  </w:abstractNum>
+  <w:abstractNum w:abstractNumId="7" w15:restartNumberingAfterBreak="0">
     <w:nsid w:val="5AE438E3"/>
     <w:multiLevelType w:val="multilevel"/>
     <w:tmpl w:val="2E086678"/>
@@ -5670,7 +8122,7 @@
       </w:pPr>
     </w:lvl>
   </w:abstractNum>
-  <w:abstractNum w:abstractNumId="5" w15:restartNumberingAfterBreak="0">
+  <w:abstractNum w:abstractNumId="8" w15:restartNumberingAfterBreak="0">
     <w:nsid w:val="5EAF3106"/>
     <w:multiLevelType w:val="multilevel"/>
     <w:tmpl w:val="BAC0F514"/>
@@ -5784,7 +8236,120 @@
       </w:pPr>
     </w:lvl>
   </w:abstractNum>
-  <w:abstractNum w:abstractNumId="6" w15:restartNumberingAfterBreak="0">
+  <w:abstractNum w:abstractNumId="9" w15:restartNumberingAfterBreak="0">
+    <w:nsid w:val="65AD57A4"/>
+    <w:multiLevelType w:val="hybridMultilevel"/>
+    <w:tmpl w:val="0BD8D23E"/>
+    <w:lvl w:ilvl="0" w:tplc="080A0001">
+      <w:start w:val="1"/>
+      <w:numFmt w:val="bullet"/>
+      <w:lvlText w:val=""/>
+      <w:lvlJc w:val="left"/>
+      <w:pPr>
+        <w:ind w:left="1080" w:hanging="360"/>
+      </w:pPr>
+      <w:rPr>
+        <w:rFonts w:ascii="Symbol" w:hAnsi="Symbol" w:hint="default"/>
+      </w:rPr>
+    </w:lvl>
+    <w:lvl w:ilvl="1" w:tplc="080A0003" w:tentative="1">
+      <w:start w:val="1"/>
+      <w:numFmt w:val="bullet"/>
+      <w:lvlText w:val="o"/>
+      <w:lvlJc w:val="left"/>
+      <w:pPr>
+        <w:ind w:left="1800" w:hanging="360"/>
+      </w:pPr>
+      <w:rPr>
+        <w:rFonts w:ascii="Courier New" w:hAnsi="Courier New" w:cs="Courier New" w:hint="default"/>
+      </w:rPr>
+    </w:lvl>
+    <w:lvl w:ilvl="2" w:tplc="080A0005" w:tentative="1">
+      <w:start w:val="1"/>
+      <w:numFmt w:val="bullet"/>
+      <w:lvlText w:val=""/>
+      <w:lvlJc w:val="left"/>
+      <w:pPr>
+        <w:ind w:left="2520" w:hanging="360"/>
+      </w:pPr>
+      <w:rPr>
+        <w:rFonts w:ascii="Wingdings" w:hAnsi="Wingdings" w:hint="default"/>
+      </w:rPr>
+    </w:lvl>
+    <w:lvl w:ilvl="3" w:tplc="080A0001" w:tentative="1">
+      <w:start w:val="1"/>
+      <w:numFmt w:val="bullet"/>
+      <w:lvlText w:val=""/>
+      <w:lvlJc w:val="left"/>
+      <w:pPr>
+        <w:ind w:left="3240" w:hanging="360"/>
+      </w:pPr>
+      <w:rPr>
+        <w:rFonts w:ascii="Symbol" w:hAnsi="Symbol" w:hint="default"/>
+      </w:rPr>
+    </w:lvl>
+    <w:lvl w:ilvl="4" w:tplc="080A0003" w:tentative="1">
+      <w:start w:val="1"/>
+      <w:numFmt w:val="bullet"/>
+      <w:lvlText w:val="o"/>
+      <w:lvlJc w:val="left"/>
+      <w:pPr>
+        <w:ind w:left="3960" w:hanging="360"/>
+      </w:pPr>
+      <w:rPr>
+        <w:rFonts w:ascii="Courier New" w:hAnsi="Courier New" w:cs="Courier New" w:hint="default"/>
+      </w:rPr>
+    </w:lvl>
+    <w:lvl w:ilvl="5" w:tplc="080A0005" w:tentative="1">
+      <w:start w:val="1"/>
+      <w:numFmt w:val="bullet"/>
+      <w:lvlText w:val=""/>
+      <w:lvlJc w:val="left"/>
+      <w:pPr>
+        <w:ind w:left="4680" w:hanging="360"/>
+      </w:pPr>
+      <w:rPr>
+        <w:rFonts w:ascii="Wingdings" w:hAnsi="Wingdings" w:hint="default"/>
+      </w:rPr>
+    </w:lvl>
+    <w:lvl w:ilvl="6" w:tplc="080A0001" w:tentative="1">
+      <w:start w:val="1"/>
+      <w:numFmt w:val="bullet"/>
+      <w:lvlText w:val=""/>
+      <w:lvlJc w:val="left"/>
+      <w:pPr>
+        <w:ind w:left="5400" w:hanging="360"/>
+      </w:pPr>
+      <w:rPr>
+        <w:rFonts w:ascii="Symbol" w:hAnsi="Symbol" w:hint="default"/>
+      </w:rPr>
+    </w:lvl>
+    <w:lvl w:ilvl="7" w:tplc="080A0003" w:tentative="1">
+      <w:start w:val="1"/>
+      <w:numFmt w:val="bullet"/>
+      <w:lvlText w:val="o"/>
+      <w:lvlJc w:val="left"/>
+      <w:pPr>
+        <w:ind w:left="6120" w:hanging="360"/>
+      </w:pPr>
+      <w:rPr>
+        <w:rFonts w:ascii="Courier New" w:hAnsi="Courier New" w:cs="Courier New" w:hint="default"/>
+      </w:rPr>
+    </w:lvl>
+    <w:lvl w:ilvl="8" w:tplc="080A0005" w:tentative="1">
+      <w:start w:val="1"/>
+      <w:numFmt w:val="bullet"/>
+      <w:lvlText w:val=""/>
+      <w:lvlJc w:val="left"/>
+      <w:pPr>
+        <w:ind w:left="6840" w:hanging="360"/>
+      </w:pPr>
+      <w:rPr>
+        <w:rFonts w:ascii="Wingdings" w:hAnsi="Wingdings" w:hint="default"/>
+      </w:rPr>
+    </w:lvl>
+  </w:abstractNum>
+  <w:abstractNum w:abstractNumId="10" w15:restartNumberingAfterBreak="0">
     <w:nsid w:val="76E92848"/>
     <w:multiLevelType w:val="multilevel"/>
     <w:tmpl w:val="0ACCAD3A"/>
@@ -5902,25 +8467,37 @@
     </w:lvl>
   </w:abstractNum>
   <w:num w:numId="1" w16cid:durableId="1889491549">
+    <w:abstractNumId w:val="2"/>
+  </w:num>
+  <w:num w:numId="2" w16cid:durableId="768811783">
+    <w:abstractNumId w:val="5"/>
+  </w:num>
+  <w:num w:numId="3" w16cid:durableId="1780952354">
+    <w:abstractNumId w:val="10"/>
+  </w:num>
+  <w:num w:numId="4" w16cid:durableId="67726321">
+    <w:abstractNumId w:val="8"/>
+  </w:num>
+  <w:num w:numId="5" w16cid:durableId="934484768">
+    <w:abstractNumId w:val="7"/>
+  </w:num>
+  <w:num w:numId="6" w16cid:durableId="163009743">
+    <w:abstractNumId w:val="4"/>
+  </w:num>
+  <w:num w:numId="7" w16cid:durableId="466776079">
+    <w:abstractNumId w:val="3"/>
+  </w:num>
+  <w:num w:numId="8" w16cid:durableId="263079550">
     <w:abstractNumId w:val="0"/>
   </w:num>
-  <w:num w:numId="2" w16cid:durableId="768811783">
-    <w:abstractNumId w:val="3"/>
+  <w:num w:numId="9" w16cid:durableId="712730109">
+    <w:abstractNumId w:val="9"/>
   </w:num>
-  <w:num w:numId="3" w16cid:durableId="1780952354">
+  <w:num w:numId="10" w16cid:durableId="1156384170">
+    <w:abstractNumId w:val="1"/>
+  </w:num>
+  <w:num w:numId="11" w16cid:durableId="1094592476">
     <w:abstractNumId w:val="6"/>
-  </w:num>
-  <w:num w:numId="4" w16cid:durableId="67726321">
-    <w:abstractNumId w:val="5"/>
-  </w:num>
-  <w:num w:numId="5" w16cid:durableId="934484768">
-    <w:abstractNumId w:val="4"/>
-  </w:num>
-  <w:num w:numId="6" w16cid:durableId="163009743">
-    <w:abstractNumId w:val="2"/>
-  </w:num>
-  <w:num w:numId="7" w16cid:durableId="466776079">
-    <w:abstractNumId w:val="1"/>
   </w:num>
 </w:numbering>
 </file>

</xml_diff>